<commit_message>
feat: Add dataset conversion script and refined dataset, and update article with dataset reformatting details and minor text clarifications.
</commit_message>
<xml_diff>
--- a/Catatan-Harian-Top-Tiers-Profesor-Doktor_Updated.docx
+++ b/Catatan-Harian-Top-Tiers-Profesor-Doktor_Updated.docx
@@ -140,7 +140,7 @@
                   <v:h position="#0,topLeft" xrange="0,21600"/>
                 </v:handles>
               </v:shapetype>
-              <v:shape id="Arrow: Pentagon 17" o:spid="_x0000_s1026" type="#_x0000_t15" style="position:absolute;left:0;text-align:left;margin-left:415pt;margin-top:-68.5pt;width:176pt;height:27.6pt;flip:x;z-index:251663360;visibility:visible;mso-wrap-style:square;mso-width-percent:0;mso-height-percent:0;mso-wrap-distance-left:9pt;mso-wrap-distance-top:0;mso-wrap-distance-right:9pt;mso-wrap-distance-bottom:0;mso-position-horizontal:absolute;mso-position-horizontal-relative:page;mso-position-vertical:absolute;mso-position-vertical-relative:text;mso-width-percent:0;mso-height-percent:0;mso-width-relative:margin;mso-height-relative:margin;v-text-anchor:middle" o:gfxdata="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" adj="20445" fillcolor="yellow" strokecolor="#4472c4 [3204]" strokeweight="1pt">
+              <v:shape id="Arrow: Pentagon 17" o:spid="_x0000_s1026" type="#_x0000_t15" style="position:absolute;left:0;text-align:left;margin-left:415pt;margin-top:-68.5pt;width:176pt;height:27.6pt;flip:x;z-index:251663360;visibility:visible;mso-wrap-style:square;mso-width-percent:0;mso-height-percent:0;mso-wrap-distance-left:9pt;mso-wrap-distance-top:0;mso-wrap-distance-right:9pt;mso-wrap-distance-bottom:0;mso-position-horizontal:absolute;mso-position-horizontal-relative:page;mso-position-vertical:absolute;mso-position-vertical-relative:text;mso-width-percent:0;mso-height-percent:0;mso-width-relative:margin;mso-height-relative:margin;v-text-anchor:middle" o:gfxdata="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" adj="20445" fillcolor="yellow" strokecolor="#4472c4 [3204]" strokeweight="1pt">
                 <v:textbox>
                   <w:txbxContent>
                     <w:p>
@@ -328,7 +328,6 @@
           </wp:anchor>
         </w:drawing>
       </w:r>
-      <w:proofErr w:type="gramStart"/>
       <w:r>
         <w:rPr>
           <w:b/>
@@ -336,17 +335,7 @@
           <w:color w:val="000000" w:themeColor="text1"/>
           <w:lang w:val="en-US"/>
         </w:rPr>
-        <w:t>BIDANG :</w:t>
-      </w:r>
-      <w:proofErr w:type="gramEnd"/>
-      <w:r>
-        <w:rPr>
-          <w:b/>
-          <w:bCs/>
-          <w:color w:val="000000" w:themeColor="text1"/>
-          <w:lang w:val="en-US"/>
-        </w:rPr>
-        <w:t xml:space="preserve"> …</w:t>
+        <w:t>BIDANG : …</w:t>
       </w:r>
     </w:p>
     <w:p>
@@ -417,7 +406,7 @@
           <w:sz w:val="28"/>
           <w:szCs w:val="28"/>
         </w:rPr>
-        <w:t xml:space="preserve">TOP TIERS </w:t>
+        <w:t xml:space="preserve">POST DOC RESEARCHER </w:t>
       </w:r>
       <w:r>
         <w:rPr>
@@ -427,7 +416,7 @@
           <w:sz w:val="28"/>
           <w:szCs w:val="28"/>
         </w:rPr>
-        <w:t>PROFESOR / DOKTOR</w:t>
+        <w:t>DARI DALAM NEGERI</w:t>
       </w:r>
     </w:p>
     <w:bookmarkEnd w:id="0"/>
@@ -688,30 +677,7 @@
           <w:szCs w:val="28"/>
           <w:lang w:val="fi-FI"/>
         </w:rPr>
-        <w:t>(</w:t>
-      </w:r>
-      <w:r>
-        <w:rPr>
-          <w:rFonts w:ascii="Times New Roman" w:hAnsi="Times New Roman" w:cs="Times New Roman"/>
-          <w:b/>
-          <w:bCs/>
-          <w:color w:val="000000" w:themeColor="text1"/>
-          <w:sz w:val="28"/>
-          <w:szCs w:val="28"/>
-        </w:rPr>
-        <w:t xml:space="preserve">JUDUL </w:t>
-      </w:r>
-      <w:r>
-        <w:rPr>
-          <w:rFonts w:ascii="Times New Roman" w:hAnsi="Times New Roman" w:cs="Times New Roman"/>
-          <w:b/>
-          <w:bCs/>
-          <w:color w:val="000000" w:themeColor="text1"/>
-          <w:sz w:val="28"/>
-          <w:szCs w:val="28"/>
-          <w:lang w:val="fi-FI"/>
-        </w:rPr>
-        <w:t>……….)</w:t>
+        <w:t>Pengembangan Agentic AI untuk Deteksi Native Ads pada Portal Berita Elektronik</w:t>
       </w:r>
     </w:p>
     <w:p>
@@ -752,7 +718,6 @@
     </w:p>
     <w:p>
       <w:pPr>
-        <w:ind w:left="720" w:firstLine="720"/>
         <w:rPr>
           <w:color w:val="000000" w:themeColor="text1"/>
         </w:rPr>
@@ -761,80 +726,38 @@
         <w:rPr>
           <w:color w:val="000000" w:themeColor="text1"/>
         </w:rPr>
-        <w:t>K</w:t>
+        <w:t>Nama Pengusul</w:t>
       </w:r>
       <w:r>
         <w:rPr>
           <w:color w:val="000000" w:themeColor="text1"/>
-          <w:lang w:val="fi-FI"/>
-        </w:rPr>
-        <w:t>etua</w:t>
-      </w:r>
-      <w:r>
-        <w:rPr>
-          <w:color w:val="000000" w:themeColor="text1"/>
-        </w:rPr>
-        <w:t xml:space="preserve"> Peneliti</w:t>
-      </w:r>
-      <w:r>
-        <w:rPr>
-          <w:color w:val="000000" w:themeColor="text1"/>
         </w:rPr>
         <w:tab/>
-      </w:r>
-      <w:r>
-        <w:rPr>
-          <w:color w:val="000000" w:themeColor="text1"/>
-        </w:rPr>
-        <w:tab/>
-        <w:t>: Nama / Departemen/ Fakultas / Instansi</w:t>
+        <w:t>: Prof. Dr. Ir. Diana Purwitasari, S.Kom., M.Sc / Teknik Informatika/ Fakultas Teknologi Elektro dan Informatika Cerdas/ Institut Teknologi Sepuluh Nopember</w:t>
       </w:r>
     </w:p>
     <w:p>
       <w:pPr>
-        <w:ind w:left="720" w:firstLine="720"/>
         <w:rPr>
           <w:color w:val="000000" w:themeColor="text1"/>
-          <w:lang w:val="fi-FI"/>
         </w:rPr>
       </w:pPr>
       <w:r>
         <w:rPr>
           <w:color w:val="000000" w:themeColor="text1"/>
-          <w:lang w:val="fi-FI"/>
-        </w:rPr>
-        <w:t>Anggota</w:t>
+        </w:rPr>
+        <w:t xml:space="preserve">Kandidat Post Doctoral </w:t>
       </w:r>
       <w:r>
         <w:rPr>
           <w:color w:val="000000" w:themeColor="text1"/>
         </w:rPr>
-        <w:t xml:space="preserve"> Peneliti</w:t>
-      </w:r>
-      <w:r>
-        <w:rPr>
-          <w:color w:val="000000" w:themeColor="text1"/>
-          <w:lang w:val="fi-FI"/>
-        </w:rPr>
         <w:tab/>
-      </w:r>
-      <w:r>
-        <w:rPr>
-          <w:color w:val="000000" w:themeColor="text1"/>
-        </w:rPr>
-        <w:t>:</w:t>
-      </w:r>
-      <w:r>
-        <w:rPr>
-          <w:color w:val="000000" w:themeColor="text1"/>
-          <w:lang w:val="fi-FI"/>
-        </w:rPr>
-        <w:t xml:space="preserve"> </w:t>
+        <w:t>: Dr. Brian Rizqi Paradisiaca Darnoto, S.Kom., M.Kom</w:t>
       </w:r>
     </w:p>
     <w:p>
       <w:pPr>
-        <w:jc w:val="center"/>
         <w:rPr>
           <w:color w:val="000000" w:themeColor="text1"/>
         </w:rPr>
@@ -843,12 +766,24 @@
         <w:rPr>
           <w:color w:val="000000" w:themeColor="text1"/>
         </w:rPr>
-        <w:t>1. Nama / Departemen/ Fakultas / Instansi</w:t>
+        <w:t>Adjunct Profesor</w:t>
+      </w:r>
+      <w:r>
+        <w:rPr>
+          <w:color w:val="000000" w:themeColor="text1"/>
+        </w:rPr>
+        <w:tab/>
+      </w:r>
+      <w:r>
+        <w:rPr>
+          <w:color w:val="000000" w:themeColor="text1"/>
+        </w:rPr>
+        <w:tab/>
+        <w:t>: Dr. Sinyinda Muwanei</w:t>
       </w:r>
     </w:p>
     <w:p>
       <w:pPr>
-        <w:jc w:val="center"/>
         <w:rPr>
           <w:color w:val="000000" w:themeColor="text1"/>
         </w:rPr>
@@ -857,43 +792,21 @@
         <w:rPr>
           <w:color w:val="000000" w:themeColor="text1"/>
         </w:rPr>
-        <w:t>2. Nama / Departemen/ Fakultas / Instansi</w:t>
+        <w:t>Anggota Peneliti</w:t>
       </w:r>
-    </w:p>
-    <w:p>
-      <w:pPr>
-        <w:jc w:val="center"/>
+      <w:r>
         <w:rPr>
           <w:color w:val="000000" w:themeColor="text1"/>
         </w:rPr>
-      </w:pPr>
+        <w:tab/>
+      </w:r>
       <w:r>
         <w:rPr>
           <w:color w:val="000000" w:themeColor="text1"/>
         </w:rPr>
-        <w:t>3. Nama / Departemen/ Fakultas / Instansi</w:t>
+        <w:tab/>
+        <w:t>: Prof. Daniel Oranova Siahaan, S.Kom., M.Sc., PD.Eng / Teknik Informatika/ Fakultas Teknologi Elektro dan Informatika Cerdas/ Institut Teknologi Sepuluh Nopember</w:t>
       </w:r>
-    </w:p>
-    <w:p>
-      <w:pPr>
-        <w:jc w:val="center"/>
-        <w:rPr>
-          <w:color w:val="000000" w:themeColor="text1"/>
-        </w:rPr>
-      </w:pPr>
-      <w:r>
-        <w:rPr>
-          <w:color w:val="000000" w:themeColor="text1"/>
-        </w:rPr>
-        <w:t>Dst.</w:t>
-      </w:r>
-    </w:p>
-    <w:p>
-      <w:pPr>
-        <w:rPr>
-          <w:color w:val="000000" w:themeColor="text1"/>
-        </w:rPr>
-      </w:pPr>
     </w:p>
     <w:p>
       <w:pPr>
@@ -1014,7 +927,6 @@
           <w:szCs w:val="24"/>
         </w:rPr>
       </w:pPr>
-      <w:proofErr w:type="spellStart"/>
       <w:r>
         <w:rPr>
           <w:rFonts w:ascii="Times New Roman" w:eastAsia="Times New Roman" w:hAnsi="Times New Roman" w:cs="Times New Roman"/>
@@ -1023,109 +935,8 @@
           <w:sz w:val="24"/>
           <w:szCs w:val="24"/>
         </w:rPr>
-        <w:t>Nomor</w:t>
+        <w:t>Nomor Kontrak Turunan : ...../PKS/ITS/2025</w:t>
       </w:r>
-      <w:proofErr w:type="spellEnd"/>
-      <w:r>
-        <w:rPr>
-          <w:rFonts w:ascii="Times New Roman" w:eastAsia="Times New Roman" w:hAnsi="Times New Roman" w:cs="Times New Roman"/>
-          <w:color w:val="auto"/>
-          <w:spacing w:val="0"/>
-          <w:sz w:val="24"/>
-          <w:szCs w:val="24"/>
-        </w:rPr>
-        <w:t xml:space="preserve"> </w:t>
-      </w:r>
-      <w:proofErr w:type="spellStart"/>
-      <w:r>
-        <w:rPr>
-          <w:rFonts w:ascii="Times New Roman" w:eastAsia="Times New Roman" w:hAnsi="Times New Roman" w:cs="Times New Roman"/>
-          <w:color w:val="auto"/>
-          <w:spacing w:val="0"/>
-          <w:sz w:val="24"/>
-          <w:szCs w:val="24"/>
-        </w:rPr>
-        <w:t>Kontrak</w:t>
-      </w:r>
-      <w:proofErr w:type="spellEnd"/>
-      <w:r>
-        <w:rPr>
-          <w:rFonts w:ascii="Times New Roman" w:eastAsia="Times New Roman" w:hAnsi="Times New Roman" w:cs="Times New Roman"/>
-          <w:color w:val="auto"/>
-          <w:spacing w:val="0"/>
-          <w:sz w:val="24"/>
-          <w:szCs w:val="24"/>
-        </w:rPr>
-        <w:t xml:space="preserve"> </w:t>
-      </w:r>
-      <w:proofErr w:type="spellStart"/>
-      <w:proofErr w:type="gramStart"/>
-      <w:r>
-        <w:rPr>
-          <w:rFonts w:ascii="Times New Roman" w:eastAsia="Times New Roman" w:hAnsi="Times New Roman" w:cs="Times New Roman"/>
-          <w:color w:val="auto"/>
-          <w:spacing w:val="0"/>
-          <w:sz w:val="24"/>
-          <w:szCs w:val="24"/>
-        </w:rPr>
-        <w:t>Turunan</w:t>
-      </w:r>
-      <w:proofErr w:type="spellEnd"/>
-      <w:r>
-        <w:rPr>
-          <w:rFonts w:ascii="Times New Roman" w:eastAsia="Times New Roman" w:hAnsi="Times New Roman" w:cs="Times New Roman"/>
-          <w:color w:val="auto"/>
-          <w:spacing w:val="0"/>
-          <w:sz w:val="24"/>
-          <w:szCs w:val="24"/>
-        </w:rPr>
-        <w:t xml:space="preserve"> :</w:t>
-      </w:r>
-      <w:proofErr w:type="gramEnd"/>
-      <w:r>
-        <w:rPr>
-          <w:rFonts w:ascii="Times New Roman" w:eastAsia="Times New Roman" w:hAnsi="Times New Roman" w:cs="Times New Roman"/>
-          <w:color w:val="auto"/>
-          <w:spacing w:val="0"/>
-          <w:sz w:val="24"/>
-          <w:szCs w:val="24"/>
-        </w:rPr>
-        <w:t xml:space="preserve"> </w:t>
-      </w:r>
-      <w:proofErr w:type="gramStart"/>
-      <w:r>
-        <w:rPr>
-          <w:rFonts w:ascii="Times New Roman" w:eastAsia="Times New Roman" w:hAnsi="Times New Roman" w:cs="Times New Roman"/>
-          <w:color w:val="auto"/>
-          <w:spacing w:val="0"/>
-          <w:sz w:val="24"/>
-          <w:szCs w:val="24"/>
-        </w:rPr>
-        <w:t>.....</w:t>
-      </w:r>
-      <w:proofErr w:type="gramEnd"/>
-      <w:r>
-        <w:rPr>
-          <w:rFonts w:ascii="Times New Roman" w:eastAsia="Times New Roman" w:hAnsi="Times New Roman" w:cs="Times New Roman"/>
-          <w:color w:val="auto"/>
-          <w:spacing w:val="0"/>
-          <w:sz w:val="24"/>
-          <w:szCs w:val="24"/>
-        </w:rPr>
-        <w:t>/PKS/ITS/2025</w:t>
-      </w:r>
-    </w:p>
-    <w:p>
-      <w:pPr>
-        <w:spacing w:after="20"/>
-        <w:ind w:right="20"/>
-        <w:rPr>
-          <w:bCs/>
-          <w:color w:val="000000" w:themeColor="text1"/>
-          <w:szCs w:val="28"/>
-          <w:lang w:val="en-US"/>
-        </w:rPr>
-      </w:pPr>
     </w:p>
     <w:p>
       <w:pPr>
@@ -1289,7 +1100,6 @@
                 <w:color w:val="000000"/>
                 <w:lang w:eastAsia="id-ID"/>
               </w:rPr>
-              <w:lastRenderedPageBreak/>
               <w:t xml:space="preserve">No </w:t>
             </w:r>
           </w:p>
@@ -1358,7 +1168,7 @@
       <w:tr>
         <w:tc>
           <w:tcPr>
-            <w:tcW w:type="dxa" w:w="570"/>
+            <w:tcW w:w="570" w:type="dxa"/>
           </w:tcPr>
           <w:p>
             <w:r>
@@ -1368,7 +1178,7 @@
         </w:tc>
         <w:tc>
           <w:tcPr>
-            <w:tcW w:type="dxa" w:w="1948"/>
+            <w:tcW w:w="1948" w:type="dxa"/>
           </w:tcPr>
           <w:p>
             <w:r>
@@ -1378,21 +1188,23 @@
         </w:tc>
         <w:tc>
           <w:tcPr>
-            <w:tcW w:type="dxa" w:w="6602"/>
+            <w:tcW w:w="6602" w:type="dxa"/>
           </w:tcPr>
           <w:p>
             <w:r>
               <w:t>Catatan: Inisiasi penelitian dan penetapan ruang lingkup proyek deteksi advertorial.</w:t>
-              <w:br/>
-              <w:t>Dokumen Pendukung:</w:t>
-            </w:r>
-          </w:p>
-        </w:tc>
-      </w:tr>
-      <w:tr>
-        <w:tc>
-          <w:tcPr>
-            <w:tcW w:type="dxa" w:w="570"/>
+            </w:r>
+            <w:r>
+              <w:br/>
+              <w:t>Dokumen Pendukung:</w:t>
+            </w:r>
+          </w:p>
+        </w:tc>
+      </w:tr>
+      <w:tr>
+        <w:tc>
+          <w:tcPr>
+            <w:tcW w:w="570" w:type="dxa"/>
           </w:tcPr>
           <w:p>
             <w:r>
@@ -1402,7 +1214,7 @@
         </w:tc>
         <w:tc>
           <w:tcPr>
-            <w:tcW w:type="dxa" w:w="1948"/>
+            <w:tcW w:w="1948" w:type="dxa"/>
           </w:tcPr>
           <w:p>
             <w:r>
@@ -1412,21 +1224,23 @@
         </w:tc>
         <w:tc>
           <w:tcPr>
-            <w:tcW w:type="dxa" w:w="6602"/>
+            <w:tcW w:w="6602" w:type="dxa"/>
           </w:tcPr>
           <w:p>
             <w:r>
               <w:t>Catatan: Studi literatur komprehensif terkait mekanisme deteksi native ads terkini.</w:t>
-              <w:br/>
-              <w:t>Dokumen Pendukung:</w:t>
-            </w:r>
-          </w:p>
-        </w:tc>
-      </w:tr>
-      <w:tr>
-        <w:tc>
-          <w:tcPr>
-            <w:tcW w:type="dxa" w:w="570"/>
+            </w:r>
+            <w:r>
+              <w:br/>
+              <w:t>Dokumen Pendukung:</w:t>
+            </w:r>
+          </w:p>
+        </w:tc>
+      </w:tr>
+      <w:tr>
+        <w:tc>
+          <w:tcPr>
+            <w:tcW w:w="570" w:type="dxa"/>
           </w:tcPr>
           <w:p>
             <w:r>
@@ -1436,7 +1250,7 @@
         </w:tc>
         <w:tc>
           <w:tcPr>
-            <w:tcW w:type="dxa" w:w="1948"/>
+            <w:tcW w:w="1948" w:type="dxa"/>
           </w:tcPr>
           <w:p>
             <w:r>
@@ -1446,21 +1260,23 @@
         </w:tc>
         <w:tc>
           <w:tcPr>
-            <w:tcW w:type="dxa" w:w="6602"/>
+            <w:tcW w:w="6602" w:type="dxa"/>
           </w:tcPr>
           <w:p>
             <w:r>
               <w:t>Catatan: Penyusunan kriteria dan batasan dari dataset awal yang akan dikumpulkan.</w:t>
-              <w:br/>
-              <w:t>Dokumen Pendukung:</w:t>
-            </w:r>
-          </w:p>
-        </w:tc>
-      </w:tr>
-      <w:tr>
-        <w:tc>
-          <w:tcPr>
-            <w:tcW w:type="dxa" w:w="570"/>
+            </w:r>
+            <w:r>
+              <w:br/>
+              <w:t>Dokumen Pendukung:</w:t>
+            </w:r>
+          </w:p>
+        </w:tc>
+      </w:tr>
+      <w:tr>
+        <w:tc>
+          <w:tcPr>
+            <w:tcW w:w="570" w:type="dxa"/>
           </w:tcPr>
           <w:p>
             <w:r>
@@ -1470,7 +1286,7 @@
         </w:tc>
         <w:tc>
           <w:tcPr>
-            <w:tcW w:type="dxa" w:w="1948"/>
+            <w:tcW w:w="1948" w:type="dxa"/>
           </w:tcPr>
           <w:p>
             <w:r>
@@ -1480,21 +1296,23 @@
         </w:tc>
         <w:tc>
           <w:tcPr>
-            <w:tcW w:type="dxa" w:w="6602"/>
+            <w:tcW w:w="6602" w:type="dxa"/>
           </w:tcPr>
           <w:p>
             <w:r>
               <w:t>Catatan: Eksekusi pengumpulan dataset artikel berita elektronik dari portal Indonesia.</w:t>
-              <w:br/>
-              <w:t>Dokumen Pendukung:</w:t>
-            </w:r>
-          </w:p>
-        </w:tc>
-      </w:tr>
-      <w:tr>
-        <w:tc>
-          <w:tcPr>
-            <w:tcW w:type="dxa" w:w="570"/>
+            </w:r>
+            <w:r>
+              <w:br/>
+              <w:t>Dokumen Pendukung:</w:t>
+            </w:r>
+          </w:p>
+        </w:tc>
+      </w:tr>
+      <w:tr>
+        <w:tc>
+          <w:tcPr>
+            <w:tcW w:w="570" w:type="dxa"/>
           </w:tcPr>
           <w:p>
             <w:r>
@@ -1504,7 +1322,7 @@
         </w:tc>
         <w:tc>
           <w:tcPr>
-            <w:tcW w:type="dxa" w:w="1948"/>
+            <w:tcW w:w="1948" w:type="dxa"/>
           </w:tcPr>
           <w:p>
             <w:r>
@@ -1514,21 +1332,23 @@
         </w:tc>
         <w:tc>
           <w:tcPr>
-            <w:tcW w:type="dxa" w:w="6602"/>
+            <w:tcW w:w="6602" w:type="dxa"/>
           </w:tcPr>
           <w:p>
             <w:r>
               <w:t>Catatan: Validasi dan kurasi manual subset pertama dari dataset awal yang terkumpul.</w:t>
-              <w:br/>
-              <w:t>Dokumen Pendukung:</w:t>
-            </w:r>
-          </w:p>
-        </w:tc>
-      </w:tr>
-      <w:tr>
-        <w:tc>
-          <w:tcPr>
-            <w:tcW w:type="dxa" w:w="570"/>
+            </w:r>
+            <w:r>
+              <w:br/>
+              <w:t>Dokumen Pendukung:</w:t>
+            </w:r>
+          </w:p>
+        </w:tc>
+      </w:tr>
+      <w:tr>
+        <w:tc>
+          <w:tcPr>
+            <w:tcW w:w="570" w:type="dxa"/>
           </w:tcPr>
           <w:p>
             <w:r>
@@ -1538,7 +1358,7 @@
         </w:tc>
         <w:tc>
           <w:tcPr>
-            <w:tcW w:type="dxa" w:w="1948"/>
+            <w:tcW w:w="1948" w:type="dxa"/>
           </w:tcPr>
           <w:p>
             <w:r>
@@ -1548,21 +1368,23 @@
         </w:tc>
         <w:tc>
           <w:tcPr>
-            <w:tcW w:type="dxa" w:w="6602"/>
+            <w:tcW w:w="6602" w:type="dxa"/>
           </w:tcPr>
           <w:p>
             <w:r>
               <w:t>Catatan: Penyiapan environment eksperimen untuk pengujian model baseline.</w:t>
-              <w:br/>
-              <w:t>Dokumen Pendukung:</w:t>
-            </w:r>
-          </w:p>
-        </w:tc>
-      </w:tr>
-      <w:tr>
-        <w:tc>
-          <w:tcPr>
-            <w:tcW w:type="dxa" w:w="570"/>
+            </w:r>
+            <w:r>
+              <w:br/>
+              <w:t>Dokumen Pendukung:</w:t>
+            </w:r>
+          </w:p>
+        </w:tc>
+      </w:tr>
+      <w:tr>
+        <w:tc>
+          <w:tcPr>
+            <w:tcW w:w="570" w:type="dxa"/>
           </w:tcPr>
           <w:p>
             <w:r>
@@ -1572,7 +1394,7 @@
         </w:tc>
         <w:tc>
           <w:tcPr>
-            <w:tcW w:type="dxa" w:w="1948"/>
+            <w:tcW w:w="1948" w:type="dxa"/>
           </w:tcPr>
           <w:p>
             <w:r>
@@ -1582,21 +1404,23 @@
         </w:tc>
         <w:tc>
           <w:tcPr>
-            <w:tcW w:type="dxa" w:w="6602"/>
+            <w:tcW w:w="6602" w:type="dxa"/>
           </w:tcPr>
           <w:p>
             <w:r>
               <w:t>Catatan: Integrasi akses API GPT-4o sebagai validator Ground Truth percobaan awal</w:t>
-              <w:br/>
-              <w:t>Dokumen Pendukung:</w:t>
-            </w:r>
-          </w:p>
-        </w:tc>
-      </w:tr>
-      <w:tr>
-        <w:tc>
-          <w:tcPr>
-            <w:tcW w:type="dxa" w:w="570"/>
+            </w:r>
+            <w:r>
+              <w:br/>
+              <w:t>Dokumen Pendukung:</w:t>
+            </w:r>
+          </w:p>
+        </w:tc>
+      </w:tr>
+      <w:tr>
+        <w:tc>
+          <w:tcPr>
+            <w:tcW w:w="570" w:type="dxa"/>
           </w:tcPr>
           <w:p>
             <w:r>
@@ -1606,7 +1430,7 @@
         </w:tc>
         <w:tc>
           <w:tcPr>
-            <w:tcW w:type="dxa" w:w="1948"/>
+            <w:tcW w:w="1948" w:type="dxa"/>
           </w:tcPr>
           <w:p>
             <w:r>
@@ -1616,21 +1440,23 @@
         </w:tc>
         <w:tc>
           <w:tcPr>
-            <w:tcW w:type="dxa" w:w="6602"/>
+            <w:tcW w:w="6602" w:type="dxa"/>
           </w:tcPr>
           <w:p>
             <w:r>
               <w:t>Catatan: Uji coba prompt engineering untuk klasifikasi native ads dengan GPT-4o.</w:t>
-              <w:br/>
-              <w:t>Dokumen Pendukung:</w:t>
-            </w:r>
-          </w:p>
-        </w:tc>
-      </w:tr>
-      <w:tr>
-        <w:tc>
-          <w:tcPr>
-            <w:tcW w:type="dxa" w:w="570"/>
+            </w:r>
+            <w:r>
+              <w:br/>
+              <w:t>Dokumen Pendukung:</w:t>
+            </w:r>
+          </w:p>
+        </w:tc>
+      </w:tr>
+      <w:tr>
+        <w:tc>
+          <w:tcPr>
+            <w:tcW w:w="570" w:type="dxa"/>
           </w:tcPr>
           <w:p>
             <w:r>
@@ -1640,7 +1466,7 @@
         </w:tc>
         <w:tc>
           <w:tcPr>
-            <w:tcW w:type="dxa" w:w="1948"/>
+            <w:tcW w:w="1948" w:type="dxa"/>
           </w:tcPr>
           <w:p>
             <w:r>
@@ -1650,21 +1476,23 @@
         </w:tc>
         <w:tc>
           <w:tcPr>
-            <w:tcW w:type="dxa" w:w="6602"/>
+            <w:tcW w:w="6602" w:type="dxa"/>
           </w:tcPr>
           <w:p>
             <w:r>
               <w:t>Catatan: Eksekusi eksperimen klasifikasi pada subset data menggunakan GPT-4o.</w:t>
-              <w:br/>
-              <w:t>Dokumen Pendukung:</w:t>
-            </w:r>
-          </w:p>
-        </w:tc>
-      </w:tr>
-      <w:tr>
-        <w:tc>
-          <w:tcPr>
-            <w:tcW w:type="dxa" w:w="570"/>
+            </w:r>
+            <w:r>
+              <w:br/>
+              <w:t>Dokumen Pendukung:</w:t>
+            </w:r>
+          </w:p>
+        </w:tc>
+      </w:tr>
+      <w:tr>
+        <w:tc>
+          <w:tcPr>
+            <w:tcW w:w="570" w:type="dxa"/>
           </w:tcPr>
           <w:p>
             <w:r>
@@ -1674,7 +1502,7 @@
         </w:tc>
         <w:tc>
           <w:tcPr>
-            <w:tcW w:type="dxa" w:w="1948"/>
+            <w:tcW w:w="1948" w:type="dxa"/>
           </w:tcPr>
           <w:p>
             <w:r>
@@ -1684,21 +1512,23 @@
         </w:tc>
         <w:tc>
           <w:tcPr>
-            <w:tcW w:type="dxa" w:w="6602"/>
+            <w:tcW w:w="6602" w:type="dxa"/>
           </w:tcPr>
           <w:p>
             <w:r>
               <w:t>Catatan: Evaluasi kinerja dan rekapitulasi performa GPT-4o sebagai metrik baseline.</w:t>
-              <w:br/>
-              <w:t>Dokumen Pendukung:</w:t>
-            </w:r>
-          </w:p>
-        </w:tc>
-      </w:tr>
-      <w:tr>
-        <w:tc>
-          <w:tcPr>
-            <w:tcW w:type="dxa" w:w="570"/>
+            </w:r>
+            <w:r>
+              <w:br/>
+              <w:t>Dokumen Pendukung:</w:t>
+            </w:r>
+          </w:p>
+        </w:tc>
+      </w:tr>
+      <w:tr>
+        <w:tc>
+          <w:tcPr>
+            <w:tcW w:w="570" w:type="dxa"/>
           </w:tcPr>
           <w:p>
             <w:r>
@@ -1708,7 +1538,7 @@
         </w:tc>
         <w:tc>
           <w:tcPr>
-            <w:tcW w:type="dxa" w:w="1948"/>
+            <w:tcW w:w="1948" w:type="dxa"/>
           </w:tcPr>
           <w:p>
             <w:r>
@@ -1718,21 +1548,23 @@
         </w:tc>
         <w:tc>
           <w:tcPr>
-            <w:tcW w:type="dxa" w:w="6602"/>
+            <w:tcW w:w="6602" w:type="dxa"/>
           </w:tcPr>
           <w:p>
             <w:r>
               <w:t>Catatan: Identifikasi kandidat model bahasa Open-Source (OSS) yang potensial.</w:t>
-              <w:br/>
-              <w:t>Dokumen Pendukung:</w:t>
-            </w:r>
-          </w:p>
-        </w:tc>
-      </w:tr>
-      <w:tr>
-        <w:tc>
-          <w:tcPr>
-            <w:tcW w:type="dxa" w:w="570"/>
+            </w:r>
+            <w:r>
+              <w:br/>
+              <w:t>Dokumen Pendukung:</w:t>
+            </w:r>
+          </w:p>
+        </w:tc>
+      </w:tr>
+      <w:tr>
+        <w:tc>
+          <w:tcPr>
+            <w:tcW w:w="570" w:type="dxa"/>
           </w:tcPr>
           <w:p>
             <w:r>
@@ -1742,7 +1574,7 @@
         </w:tc>
         <w:tc>
           <w:tcPr>
-            <w:tcW w:type="dxa" w:w="1948"/>
+            <w:tcW w:w="1948" w:type="dxa"/>
           </w:tcPr>
           <w:p>
             <w:r>
@@ -1752,21 +1584,23 @@
         </w:tc>
         <w:tc>
           <w:tcPr>
-            <w:tcW w:type="dxa" w:w="6602"/>
+            <w:tcW w:w="6602" w:type="dxa"/>
           </w:tcPr>
           <w:p>
             <w:r>
               <w:t>Catatan: Registrasi dan setup API OpenRouter untuk memfasilitasi akses multi-model OSS.</w:t>
-              <w:br/>
-              <w:t>Dokumen Pendukung:</w:t>
-            </w:r>
-          </w:p>
-        </w:tc>
-      </w:tr>
-      <w:tr>
-        <w:tc>
-          <w:tcPr>
-            <w:tcW w:type="dxa" w:w="570"/>
+            </w:r>
+            <w:r>
+              <w:br/>
+              <w:t>Dokumen Pendukung:</w:t>
+            </w:r>
+          </w:p>
+        </w:tc>
+      </w:tr>
+      <w:tr>
+        <w:tc>
+          <w:tcPr>
+            <w:tcW w:w="570" w:type="dxa"/>
           </w:tcPr>
           <w:p>
             <w:r>
@@ -1776,7 +1610,7 @@
         </w:tc>
         <w:tc>
           <w:tcPr>
-            <w:tcW w:type="dxa" w:w="1948"/>
+            <w:tcW w:w="1948" w:type="dxa"/>
           </w:tcPr>
           <w:p>
             <w:r>
@@ -1786,21 +1620,23 @@
         </w:tc>
         <w:tc>
           <w:tcPr>
-            <w:tcW w:type="dxa" w:w="6602"/>
+            <w:tcW w:w="6602" w:type="dxa"/>
           </w:tcPr>
           <w:p>
             <w:r>
               <w:t>Catatan: Pembuatan skrip otomatisasi pengujian inferensi melalui endpoint OpenRouter.</w:t>
-              <w:br/>
-              <w:t>Dokumen Pendukung:</w:t>
-            </w:r>
-          </w:p>
-        </w:tc>
-      </w:tr>
-      <w:tr>
-        <w:tc>
-          <w:tcPr>
-            <w:tcW w:type="dxa" w:w="570"/>
+            </w:r>
+            <w:r>
+              <w:br/>
+              <w:t>Dokumen Pendukung:</w:t>
+            </w:r>
+          </w:p>
+        </w:tc>
+      </w:tr>
+      <w:tr>
+        <w:tc>
+          <w:tcPr>
+            <w:tcW w:w="570" w:type="dxa"/>
           </w:tcPr>
           <w:p>
             <w:r>
@@ -1810,7 +1646,7 @@
         </w:tc>
         <w:tc>
           <w:tcPr>
-            <w:tcW w:type="dxa" w:w="1948"/>
+            <w:tcW w:w="1948" w:type="dxa"/>
           </w:tcPr>
           <w:p>
             <w:r>
@@ -1820,21 +1656,23 @@
         </w:tc>
         <w:tc>
           <w:tcPr>
-            <w:tcW w:type="dxa" w:w="6602"/>
+            <w:tcW w:w="6602" w:type="dxa"/>
           </w:tcPr>
           <w:p>
             <w:r>
               <w:t>Catatan: Pengumpulan hasil inferensi eksperimen beberapa kandidat model OSS.</w:t>
-              <w:br/>
-              <w:t>Dokumen Pendukung:</w:t>
-            </w:r>
-          </w:p>
-        </w:tc>
-      </w:tr>
-      <w:tr>
-        <w:tc>
-          <w:tcPr>
-            <w:tcW w:type="dxa" w:w="570"/>
+            </w:r>
+            <w:r>
+              <w:br/>
+              <w:t>Dokumen Pendukung:</w:t>
+            </w:r>
+          </w:p>
+        </w:tc>
+      </w:tr>
+      <w:tr>
+        <w:tc>
+          <w:tcPr>
+            <w:tcW w:w="570" w:type="dxa"/>
           </w:tcPr>
           <w:p>
             <w:r>
@@ -1844,7 +1682,7 @@
         </w:tc>
         <w:tc>
           <w:tcPr>
-            <w:tcW w:type="dxa" w:w="1948"/>
+            <w:tcW w:w="1948" w:type="dxa"/>
           </w:tcPr>
           <w:p>
             <w:r>
@@ -1854,31 +1692,34 @@
         </w:tc>
         <w:tc>
           <w:tcPr>
-            <w:tcW w:type="dxa" w:w="6602"/>
+            <w:tcW w:w="6602" w:type="dxa"/>
           </w:tcPr>
           <w:p>
             <w:r>
               <w:t>Catatan: Analisis komparatif performa deteksi antara model komersial dan terbuka (OSS).</w:t>
-              <w:br/>
-              <w:t>Dokumen Pendukung:</w:t>
-            </w:r>
-          </w:p>
-        </w:tc>
-      </w:tr>
-      <w:tr>
-        <w:tc>
-          <w:tcPr>
-            <w:tcW w:type="dxa" w:w="570"/>
-          </w:tcPr>
-          <w:p>
-            <w:r>
+            </w:r>
+            <w:r>
+              <w:br/>
+              <w:t>Dokumen Pendukung:</w:t>
+            </w:r>
+          </w:p>
+        </w:tc>
+      </w:tr>
+      <w:tr>
+        <w:tc>
+          <w:tcPr>
+            <w:tcW w:w="570" w:type="dxa"/>
+          </w:tcPr>
+          <w:p>
+            <w:r>
+              <w:lastRenderedPageBreak/>
               <w:t>16</w:t>
             </w:r>
           </w:p>
         </w:tc>
         <w:tc>
           <w:tcPr>
-            <w:tcW w:type="dxa" w:w="1948"/>
+            <w:tcW w:w="1948" w:type="dxa"/>
           </w:tcPr>
           <w:p>
             <w:r>
@@ -1888,21 +1729,23 @@
         </w:tc>
         <w:tc>
           <w:tcPr>
-            <w:tcW w:type="dxa" w:w="6602"/>
+            <w:tcW w:w="6602" w:type="dxa"/>
           </w:tcPr>
           <w:p>
             <w:r>
               <w:t>Catatan: Studi dan perancangan konsep arsitektur multi-agen untuk deteksi konten.</w:t>
-              <w:br/>
-              <w:t>Dokumen Pendukung:</w:t>
-            </w:r>
-          </w:p>
-        </w:tc>
-      </w:tr>
-      <w:tr>
-        <w:tc>
-          <w:tcPr>
-            <w:tcW w:type="dxa" w:w="570"/>
+            </w:r>
+            <w:r>
+              <w:br/>
+              <w:t>Dokumen Pendukung:</w:t>
+            </w:r>
+          </w:p>
+        </w:tc>
+      </w:tr>
+      <w:tr>
+        <w:tc>
+          <w:tcPr>
+            <w:tcW w:w="570" w:type="dxa"/>
           </w:tcPr>
           <w:p>
             <w:r>
@@ -1912,7 +1755,7 @@
         </w:tc>
         <w:tc>
           <w:tcPr>
-            <w:tcW w:type="dxa" w:w="1948"/>
+            <w:tcW w:w="1948" w:type="dxa"/>
           </w:tcPr>
           <w:p>
             <w:r>
@@ -1922,21 +1765,23 @@
         </w:tc>
         <w:tc>
           <w:tcPr>
-            <w:tcW w:type="dxa" w:w="6602"/>
+            <w:tcW w:w="6602" w:type="dxa"/>
           </w:tcPr>
           <w:p>
             <w:r>
               <w:t>Catatan: Inisialisasi desain sistem deteksi berbasis kerangka kerja LangChain.</w:t>
-              <w:br/>
-              <w:t>Dokumen Pendukung:</w:t>
-            </w:r>
-          </w:p>
-        </w:tc>
-      </w:tr>
-      <w:tr>
-        <w:tc>
-          <w:tcPr>
-            <w:tcW w:type="dxa" w:w="570"/>
+            </w:r>
+            <w:r>
+              <w:br/>
+              <w:t>Dokumen Pendukung:</w:t>
+            </w:r>
+          </w:p>
+        </w:tc>
+      </w:tr>
+      <w:tr>
+        <w:tc>
+          <w:tcPr>
+            <w:tcW w:w="570" w:type="dxa"/>
           </w:tcPr>
           <w:p>
             <w:r>
@@ -1946,7 +1791,7 @@
         </w:tc>
         <w:tc>
           <w:tcPr>
-            <w:tcW w:type="dxa" w:w="1948"/>
+            <w:tcW w:w="1948" w:type="dxa"/>
           </w:tcPr>
           <w:p>
             <w:r>
@@ -1956,21 +1801,23 @@
         </w:tc>
         <w:tc>
           <w:tcPr>
-            <w:tcW w:type="dxa" w:w="6602"/>
+            <w:tcW w:w="6602" w:type="dxa"/>
           </w:tcPr>
           <w:p>
             <w:r>
               <w:t>Catatan: Pembuatan prototipe logika komunikasi antar agen secara sistematis.</w:t>
-              <w:br/>
-              <w:t>Dokumen Pendukung:</w:t>
-            </w:r>
-          </w:p>
-        </w:tc>
-      </w:tr>
-      <w:tr>
-        <w:tc>
-          <w:tcPr>
-            <w:tcW w:type="dxa" w:w="570"/>
+            </w:r>
+            <w:r>
+              <w:br/>
+              <w:t>Dokumen Pendukung:</w:t>
+            </w:r>
+          </w:p>
+        </w:tc>
+      </w:tr>
+      <w:tr>
+        <w:tc>
+          <w:tcPr>
+            <w:tcW w:w="570" w:type="dxa"/>
           </w:tcPr>
           <w:p>
             <w:r>
@@ -1980,7 +1827,7 @@
         </w:tc>
         <w:tc>
           <w:tcPr>
-            <w:tcW w:type="dxa" w:w="1948"/>
+            <w:tcW w:w="1948" w:type="dxa"/>
           </w:tcPr>
           <w:p>
             <w:r>
@@ -1990,21 +1837,23 @@
         </w:tc>
         <w:tc>
           <w:tcPr>
-            <w:tcW w:type="dxa" w:w="6602"/>
+            <w:tcW w:w="6602" w:type="dxa"/>
           </w:tcPr>
           <w:p>
             <w:r>
               <w:t>Catatan: Implementasi orkestrasi agen dasar menggunakan objek StateGraph LangChain.</w:t>
-              <w:br/>
-              <w:t>Dokumen Pendukung:</w:t>
-            </w:r>
-          </w:p>
-        </w:tc>
-      </w:tr>
-      <w:tr>
-        <w:tc>
-          <w:tcPr>
-            <w:tcW w:type="dxa" w:w="570"/>
+            </w:r>
+            <w:r>
+              <w:br/>
+              <w:t>Dokumen Pendukung:</w:t>
+            </w:r>
+          </w:p>
+        </w:tc>
+      </w:tr>
+      <w:tr>
+        <w:tc>
+          <w:tcPr>
+            <w:tcW w:w="570" w:type="dxa"/>
           </w:tcPr>
           <w:p>
             <w:r>
@@ -2014,7 +1863,7 @@
         </w:tc>
         <w:tc>
           <w:tcPr>
-            <w:tcW w:type="dxa" w:w="1948"/>
+            <w:tcW w:w="1948" w:type="dxa"/>
           </w:tcPr>
           <w:p>
             <w:r>
@@ -2024,21 +1873,23 @@
         </w:tc>
         <w:tc>
           <w:tcPr>
-            <w:tcW w:type="dxa" w:w="6602"/>
+            <w:tcW w:w="6602" w:type="dxa"/>
           </w:tcPr>
           <w:p>
             <w:r>
               <w:t>Catatan: Pengujian dan debugging fungsionalitas alur tugas agen dalam LangChain.</w:t>
-              <w:br/>
-              <w:t>Dokumen Pendukung:</w:t>
-            </w:r>
-          </w:p>
-        </w:tc>
-      </w:tr>
-      <w:tr>
-        <w:tc>
-          <w:tcPr>
-            <w:tcW w:type="dxa" w:w="570"/>
+            </w:r>
+            <w:r>
+              <w:br/>
+              <w:t>Dokumen Pendukung:</w:t>
+            </w:r>
+          </w:p>
+        </w:tc>
+      </w:tr>
+      <w:tr>
+        <w:tc>
+          <w:tcPr>
+            <w:tcW w:w="570" w:type="dxa"/>
           </w:tcPr>
           <w:p>
             <w:r>
@@ -2048,7 +1899,7 @@
         </w:tc>
         <w:tc>
           <w:tcPr>
-            <w:tcW w:type="dxa" w:w="1948"/>
+            <w:tcW w:w="1948" w:type="dxa"/>
           </w:tcPr>
           <w:p>
             <w:r>
@@ -2058,21 +1909,23 @@
         </w:tc>
         <w:tc>
           <w:tcPr>
-            <w:tcW w:type="dxa" w:w="6602"/>
+            <w:tcW w:w="6602" w:type="dxa"/>
           </w:tcPr>
           <w:p>
             <w:r>
               <w:t>Catatan: Penyiapan korpus berita dengan nuansa persuasif untuk pengujian intensif Llama-3.</w:t>
-              <w:br/>
-              <w:t>Dokumen Pendukung:</w:t>
-            </w:r>
-          </w:p>
-        </w:tc>
-      </w:tr>
-      <w:tr>
-        <w:tc>
-          <w:tcPr>
-            <w:tcW w:type="dxa" w:w="570"/>
+            </w:r>
+            <w:r>
+              <w:br/>
+              <w:t>Dokumen Pendukung:</w:t>
+            </w:r>
+          </w:p>
+        </w:tc>
+      </w:tr>
+      <w:tr>
+        <w:tc>
+          <w:tcPr>
+            <w:tcW w:w="570" w:type="dxa"/>
           </w:tcPr>
           <w:p>
             <w:r>
@@ -2082,7 +1935,7 @@
         </w:tc>
         <w:tc>
           <w:tcPr>
-            <w:tcW w:type="dxa" w:w="1948"/>
+            <w:tcW w:w="1948" w:type="dxa"/>
           </w:tcPr>
           <w:p>
             <w:r>
@@ -2092,21 +1945,23 @@
         </w:tc>
         <w:tc>
           <w:tcPr>
-            <w:tcW w:type="dxa" w:w="6602"/>
+            <w:tcW w:w="6602" w:type="dxa"/>
           </w:tcPr>
           <w:p>
             <w:r>
               <w:t>Catatan: Konfigurasi dan penyesuaian instruksi prompt pada uji coba Llama-3.</w:t>
-              <w:br/>
-              <w:t>Dokumen Pendukung:</w:t>
-            </w:r>
-          </w:p>
-        </w:tc>
-      </w:tr>
-      <w:tr>
-        <w:tc>
-          <w:tcPr>
-            <w:tcW w:type="dxa" w:w="570"/>
+            </w:r>
+            <w:r>
+              <w:br/>
+              <w:t>Dokumen Pendukung:</w:t>
+            </w:r>
+          </w:p>
+        </w:tc>
+      </w:tr>
+      <w:tr>
+        <w:tc>
+          <w:tcPr>
+            <w:tcW w:w="570" w:type="dxa"/>
           </w:tcPr>
           <w:p>
             <w:r>
@@ -2116,7 +1971,7 @@
         </w:tc>
         <w:tc>
           <w:tcPr>
-            <w:tcW w:type="dxa" w:w="1948"/>
+            <w:tcW w:w="1948" w:type="dxa"/>
           </w:tcPr>
           <w:p>
             <w:r>
@@ -2126,21 +1981,23 @@
         </w:tc>
         <w:tc>
           <w:tcPr>
-            <w:tcW w:type="dxa" w:w="6602"/>
+            <w:tcW w:w="6602" w:type="dxa"/>
           </w:tcPr>
           <w:p>
             <w:r>
               <w:t>Catatan: Pelaksanaan eksperimen deteksi dan pemahaman fitur linguistik persuasif.</w:t>
-              <w:br/>
-              <w:t>Dokumen Pendukung:</w:t>
-            </w:r>
-          </w:p>
-        </w:tc>
-      </w:tr>
-      <w:tr>
-        <w:tc>
-          <w:tcPr>
-            <w:tcW w:type="dxa" w:w="570"/>
+            </w:r>
+            <w:r>
+              <w:br/>
+              <w:t>Dokumen Pendukung:</w:t>
+            </w:r>
+          </w:p>
+        </w:tc>
+      </w:tr>
+      <w:tr>
+        <w:tc>
+          <w:tcPr>
+            <w:tcW w:w="570" w:type="dxa"/>
           </w:tcPr>
           <w:p>
             <w:r>
@@ -2150,7 +2007,7 @@
         </w:tc>
         <w:tc>
           <w:tcPr>
-            <w:tcW w:type="dxa" w:w="1948"/>
+            <w:tcW w:w="1948" w:type="dxa"/>
           </w:tcPr>
           <w:p>
             <w:r>
@@ -2160,21 +2017,23 @@
         </w:tc>
         <w:tc>
           <w:tcPr>
-            <w:tcW w:type="dxa" w:w="6602"/>
+            <w:tcW w:w="6602" w:type="dxa"/>
           </w:tcPr>
           <w:p>
             <w:r>
               <w:t>Catatan: Analisis kesalahan (error analysis) pada pola prediksi yang terklasifikasi salah.</w:t>
-              <w:br/>
-              <w:t>Dokumen Pendukung:</w:t>
-            </w:r>
-          </w:p>
-        </w:tc>
-      </w:tr>
-      <w:tr>
-        <w:tc>
-          <w:tcPr>
-            <w:tcW w:type="dxa" w:w="570"/>
+            </w:r>
+            <w:r>
+              <w:br/>
+              <w:t>Dokumen Pendukung:</w:t>
+            </w:r>
+          </w:p>
+        </w:tc>
+      </w:tr>
+      <w:tr>
+        <w:tc>
+          <w:tcPr>
+            <w:tcW w:w="570" w:type="dxa"/>
           </w:tcPr>
           <w:p>
             <w:r>
@@ -2184,7 +2043,7 @@
         </w:tc>
         <w:tc>
           <w:tcPr>
-            <w:tcW w:type="dxa" w:w="1948"/>
+            <w:tcW w:w="1948" w:type="dxa"/>
           </w:tcPr>
           <w:p>
             <w:r>
@@ -2194,21 +2053,23 @@
         </w:tc>
         <w:tc>
           <w:tcPr>
-            <w:tcW w:type="dxa" w:w="6602"/>
+            <w:tcW w:w="6602" w:type="dxa"/>
           </w:tcPr>
           <w:p>
             <w:r>
               <w:t>Catatan: Penyusunan laporan temuan kemampuan Llama-3 dalam memahami bahasa berita lokal.</w:t>
-              <w:br/>
-              <w:t>Dokumen Pendukung:</w:t>
-            </w:r>
-          </w:p>
-        </w:tc>
-      </w:tr>
-      <w:tr>
-        <w:tc>
-          <w:tcPr>
-            <w:tcW w:type="dxa" w:w="570"/>
+            </w:r>
+            <w:r>
+              <w:br/>
+              <w:t>Dokumen Pendukung:</w:t>
+            </w:r>
+          </w:p>
+        </w:tc>
+      </w:tr>
+      <w:tr>
+        <w:tc>
+          <w:tcPr>
+            <w:tcW w:w="570" w:type="dxa"/>
           </w:tcPr>
           <w:p>
             <w:r>
@@ -2218,7 +2079,7 @@
         </w:tc>
         <w:tc>
           <w:tcPr>
-            <w:tcW w:type="dxa" w:w="1948"/>
+            <w:tcW w:w="1948" w:type="dxa"/>
           </w:tcPr>
           <w:p>
             <w:r>
@@ -2228,21 +2089,23 @@
         </w:tc>
         <w:tc>
           <w:tcPr>
-            <w:tcW w:type="dxa" w:w="6602"/>
+            <w:tcW w:w="6602" w:type="dxa"/>
           </w:tcPr>
           <w:p>
             <w:r>
               <w:t>Catatan: Pemetaan rute pemanggilan API OpenAI dan OpenRouter pada backend proyek.</w:t>
-              <w:br/>
-              <w:t>Dokumen Pendukung:</w:t>
-            </w:r>
-          </w:p>
-        </w:tc>
-      </w:tr>
-      <w:tr>
-        <w:tc>
-          <w:tcPr>
-            <w:tcW w:type="dxa" w:w="570"/>
+            </w:r>
+            <w:r>
+              <w:br/>
+              <w:t>Dokumen Pendukung:</w:t>
+            </w:r>
+          </w:p>
+        </w:tc>
+      </w:tr>
+      <w:tr>
+        <w:tc>
+          <w:tcPr>
+            <w:tcW w:w="570" w:type="dxa"/>
           </w:tcPr>
           <w:p>
             <w:r>
@@ -2252,7 +2115,7 @@
         </w:tc>
         <w:tc>
           <w:tcPr>
-            <w:tcW w:type="dxa" w:w="1948"/>
+            <w:tcW w:w="1948" w:type="dxa"/>
           </w:tcPr>
           <w:p>
             <w:r>
@@ -2262,21 +2125,23 @@
         </w:tc>
         <w:tc>
           <w:tcPr>
-            <w:tcW w:type="dxa" w:w="6602"/>
+            <w:tcW w:w="6602" w:type="dxa"/>
           </w:tcPr>
           <w:p>
             <w:r>
               <w:t>Catatan: Pengembangan modul integrasi dinamis sistem klasifikasi ke backend utama.</w:t>
-              <w:br/>
-              <w:t>Dokumen Pendukung:</w:t>
-            </w:r>
-          </w:p>
-        </w:tc>
-      </w:tr>
-      <w:tr>
-        <w:tc>
-          <w:tcPr>
-            <w:tcW w:type="dxa" w:w="570"/>
+            </w:r>
+            <w:r>
+              <w:br/>
+              <w:t>Dokumen Pendukung:</w:t>
+            </w:r>
+          </w:p>
+        </w:tc>
+      </w:tr>
+      <w:tr>
+        <w:tc>
+          <w:tcPr>
+            <w:tcW w:w="570" w:type="dxa"/>
           </w:tcPr>
           <w:p>
             <w:r>
@@ -2286,7 +2151,7 @@
         </w:tc>
         <w:tc>
           <w:tcPr>
-            <w:tcW w:type="dxa" w:w="1948"/>
+            <w:tcW w:w="1948" w:type="dxa"/>
           </w:tcPr>
           <w:p>
             <w:r>
@@ -2296,21 +2161,23 @@
         </w:tc>
         <w:tc>
           <w:tcPr>
-            <w:tcW w:type="dxa" w:w="6602"/>
+            <w:tcW w:w="6602" w:type="dxa"/>
           </w:tcPr>
           <w:p>
             <w:r>
               <w:t>Catatan: Implementasi fungsi tracker untuk kalkulasi dan monitoring biaya akses API.</w:t>
-              <w:br/>
-              <w:t>Dokumen Pendukung:</w:t>
-            </w:r>
-          </w:p>
-        </w:tc>
-      </w:tr>
-      <w:tr>
-        <w:tc>
-          <w:tcPr>
-            <w:tcW w:type="dxa" w:w="570"/>
+            </w:r>
+            <w:r>
+              <w:br/>
+              <w:t>Dokumen Pendukung:</w:t>
+            </w:r>
+          </w:p>
+        </w:tc>
+      </w:tr>
+      <w:tr>
+        <w:tc>
+          <w:tcPr>
+            <w:tcW w:w="570" w:type="dxa"/>
           </w:tcPr>
           <w:p>
             <w:r>
@@ -2320,7 +2187,7 @@
         </w:tc>
         <w:tc>
           <w:tcPr>
-            <w:tcW w:type="dxa" w:w="1948"/>
+            <w:tcW w:w="1948" w:type="dxa"/>
           </w:tcPr>
           <w:p>
             <w:r>
@@ -2330,21 +2197,23 @@
         </w:tc>
         <w:tc>
           <w:tcPr>
-            <w:tcW w:type="dxa" w:w="6602"/>
+            <w:tcW w:w="6602" w:type="dxa"/>
           </w:tcPr>
           <w:p>
             <w:r>
               <w:t>Catatan: Optimalisasi struktur payload permintaan inferensi guna efisiensi token.</w:t>
-              <w:br/>
-              <w:t>Dokumen Pendukung:</w:t>
-            </w:r>
-          </w:p>
-        </w:tc>
-      </w:tr>
-      <w:tr>
-        <w:tc>
-          <w:tcPr>
-            <w:tcW w:type="dxa" w:w="570"/>
+            </w:r>
+            <w:r>
+              <w:br/>
+              <w:t>Dokumen Pendukung:</w:t>
+            </w:r>
+          </w:p>
+        </w:tc>
+      </w:tr>
+      <w:tr>
+        <w:tc>
+          <w:tcPr>
+            <w:tcW w:w="570" w:type="dxa"/>
           </w:tcPr>
           <w:p>
             <w:r>
@@ -2354,7 +2223,7 @@
         </w:tc>
         <w:tc>
           <w:tcPr>
-            <w:tcW w:type="dxa" w:w="1948"/>
+            <w:tcW w:w="1948" w:type="dxa"/>
           </w:tcPr>
           <w:p>
             <w:r>
@@ -2364,21 +2233,23 @@
         </w:tc>
         <w:tc>
           <w:tcPr>
-            <w:tcW w:type="dxa" w:w="6602"/>
+            <w:tcW w:w="6602" w:type="dxa"/>
           </w:tcPr>
           <w:p>
             <w:r>
               <w:t>Catatan: Finalisasi dan stress-testing kestabilan integrasi API eksternal di lingkungan backend.</w:t>
-              <w:br/>
-              <w:t>Dokumen Pendukung:</w:t>
-            </w:r>
-          </w:p>
-        </w:tc>
-      </w:tr>
-      <w:tr>
-        <w:tc>
-          <w:tcPr>
-            <w:tcW w:type="dxa" w:w="570"/>
+            </w:r>
+            <w:r>
+              <w:br/>
+              <w:t>Dokumen Pendukung:</w:t>
+            </w:r>
+          </w:p>
+        </w:tc>
+      </w:tr>
+      <w:tr>
+        <w:tc>
+          <w:tcPr>
+            <w:tcW w:w="570" w:type="dxa"/>
           </w:tcPr>
           <w:p>
             <w:r>
@@ -2388,7 +2259,7 @@
         </w:tc>
         <w:tc>
           <w:tcPr>
-            <w:tcW w:type="dxa" w:w="1948"/>
+            <w:tcW w:w="1948" w:type="dxa"/>
           </w:tcPr>
           <w:p>
             <w:r>
@@ -2398,31 +2269,34 @@
         </w:tc>
         <w:tc>
           <w:tcPr>
-            <w:tcW w:type="dxa" w:w="6602"/>
+            <w:tcW w:w="6602" w:type="dxa"/>
           </w:tcPr>
           <w:p>
             <w:r>
               <w:t>Catatan: Audit integritas data, format log, dan kualitas sampel dari dataset mentah.</w:t>
-              <w:br/>
-              <w:t>Dokumen Pendukung:</w:t>
-            </w:r>
-          </w:p>
-        </w:tc>
-      </w:tr>
-      <w:tr>
-        <w:tc>
-          <w:tcPr>
-            <w:tcW w:type="dxa" w:w="570"/>
-          </w:tcPr>
-          <w:p>
-            <w:r>
+            </w:r>
+            <w:r>
+              <w:br/>
+              <w:t>Dokumen Pendukung:</w:t>
+            </w:r>
+          </w:p>
+        </w:tc>
+      </w:tr>
+      <w:tr>
+        <w:tc>
+          <w:tcPr>
+            <w:tcW w:w="570" w:type="dxa"/>
+          </w:tcPr>
+          <w:p>
+            <w:r>
+              <w:lastRenderedPageBreak/>
               <w:t>32</w:t>
             </w:r>
           </w:p>
         </w:tc>
         <w:tc>
           <w:tcPr>
-            <w:tcW w:type="dxa" w:w="1948"/>
+            <w:tcW w:w="1948" w:type="dxa"/>
           </w:tcPr>
           <w:p>
             <w:r>
@@ -2432,21 +2306,23 @@
         </w:tc>
         <w:tc>
           <w:tcPr>
-            <w:tcW w:type="dxa" w:w="6602"/>
+            <w:tcW w:w="6602" w:type="dxa"/>
           </w:tcPr>
           <w:p>
             <w:r>
               <w:t>Catatan: Pembuatan skrip otomatisasi pembersihan teks (text cleaning &amp; preprocessing).</w:t>
-              <w:br/>
-              <w:t>Dokumen Pendukung:</w:t>
-            </w:r>
-          </w:p>
-        </w:tc>
-      </w:tr>
-      <w:tr>
-        <w:tc>
-          <w:tcPr>
-            <w:tcW w:type="dxa" w:w="570"/>
+            </w:r>
+            <w:r>
+              <w:br/>
+              <w:t>Dokumen Pendukung:</w:t>
+            </w:r>
+          </w:p>
+        </w:tc>
+      </w:tr>
+      <w:tr>
+        <w:tc>
+          <w:tcPr>
+            <w:tcW w:w="570" w:type="dxa"/>
           </w:tcPr>
           <w:p>
             <w:r>
@@ -2456,7 +2332,7 @@
         </w:tc>
         <w:tc>
           <w:tcPr>
-            <w:tcW w:type="dxa" w:w="1948"/>
+            <w:tcW w:w="1948" w:type="dxa"/>
           </w:tcPr>
           <w:p>
             <w:r>
@@ -2466,21 +2342,23 @@
         </w:tc>
         <w:tc>
           <w:tcPr>
-            <w:tcW w:type="dxa" w:w="6602"/>
+            <w:tcW w:w="6602" w:type="dxa"/>
           </w:tcPr>
           <w:p>
             <w:r>
               <w:t>Catatan: Standardisasi struktur label target dan transformasi format output ke JSON/JSONL.</w:t>
-              <w:br/>
-              <w:t>Dokumen Pendukung:</w:t>
-            </w:r>
-          </w:p>
-        </w:tc>
-      </w:tr>
-      <w:tr>
-        <w:tc>
-          <w:tcPr>
-            <w:tcW w:type="dxa" w:w="570"/>
+            </w:r>
+            <w:r>
+              <w:br/>
+              <w:t>Dokumen Pendukung:</w:t>
+            </w:r>
+          </w:p>
+        </w:tc>
+      </w:tr>
+      <w:tr>
+        <w:tc>
+          <w:tcPr>
+            <w:tcW w:w="570" w:type="dxa"/>
           </w:tcPr>
           <w:p>
             <w:r>
@@ -2490,7 +2368,7 @@
         </w:tc>
         <w:tc>
           <w:tcPr>
-            <w:tcW w:type="dxa" w:w="1948"/>
+            <w:tcW w:w="1948" w:type="dxa"/>
           </w:tcPr>
           <w:p>
             <w:r>
@@ -2500,21 +2378,23 @@
         </w:tc>
         <w:tc>
           <w:tcPr>
-            <w:tcW w:type="dxa" w:w="6602"/>
+            <w:tcW w:w="6602" w:type="dxa"/>
           </w:tcPr>
           <w:p>
             <w:r>
               <w:t>Catatan: Validasi hasil pemrosesan dan ekstraksi fitur awal untuk pipeline pembelajaran.</w:t>
-              <w:br/>
-              <w:t>Dokumen Pendukung:</w:t>
-            </w:r>
-          </w:p>
-        </w:tc>
-      </w:tr>
-      <w:tr>
-        <w:tc>
-          <w:tcPr>
-            <w:tcW w:type="dxa" w:w="570"/>
+            </w:r>
+            <w:r>
+              <w:br/>
+              <w:t>Dokumen Pendukung:</w:t>
+            </w:r>
+          </w:p>
+        </w:tc>
+      </w:tr>
+      <w:tr>
+        <w:tc>
+          <w:tcPr>
+            <w:tcW w:w="570" w:type="dxa"/>
           </w:tcPr>
           <w:p>
             <w:r>
@@ -2524,7 +2404,7 @@
         </w:tc>
         <w:tc>
           <w:tcPr>
-            <w:tcW w:type="dxa" w:w="1948"/>
+            <w:tcW w:w="1948" w:type="dxa"/>
           </w:tcPr>
           <w:p>
             <w:r>
@@ -2534,21 +2414,23 @@
         </w:tc>
         <w:tc>
           <w:tcPr>
-            <w:tcW w:type="dxa" w:w="6602"/>
+            <w:tcW w:w="6602" w:type="dxa"/>
           </w:tcPr>
           <w:p>
             <w:r>
               <w:t>Catatan: Finalisasi komposisi dataset dan pemecahan partisi (train/val/test split) untuk fine-tuning.</w:t>
-              <w:br/>
-              <w:t>Dokumen Pendukung:</w:t>
-            </w:r>
-          </w:p>
-        </w:tc>
-      </w:tr>
-      <w:tr>
-        <w:tc>
-          <w:tcPr>
-            <w:tcW w:type="dxa" w:w="570"/>
+            </w:r>
+            <w:r>
+              <w:br/>
+              <w:t>Dokumen Pendukung:</w:t>
+            </w:r>
+          </w:p>
+        </w:tc>
+      </w:tr>
+      <w:tr>
+        <w:tc>
+          <w:tcPr>
+            <w:tcW w:w="570" w:type="dxa"/>
           </w:tcPr>
           <w:p>
             <w:r>
@@ -2558,7 +2440,7 @@
         </w:tc>
         <w:tc>
           <w:tcPr>
-            <w:tcW w:type="dxa" w:w="1948"/>
+            <w:tcW w:w="1948" w:type="dxa"/>
           </w:tcPr>
           <w:p>
             <w:r>
@@ -2568,21 +2450,23 @@
         </w:tc>
         <w:tc>
           <w:tcPr>
-            <w:tcW w:type="dxa" w:w="6602"/>
+            <w:tcW w:w="6602" w:type="dxa"/>
           </w:tcPr>
           <w:p>
             <w:r>
               <w:t>Catatan: Akses awal dan audit spesifikasi pada komputasi hardware server GPU (A100).</w:t>
-              <w:br/>
-              <w:t>Dokumen Pendukung:</w:t>
-            </w:r>
-          </w:p>
-        </w:tc>
-      </w:tr>
-      <w:tr>
-        <w:tc>
-          <w:tcPr>
-            <w:tcW w:type="dxa" w:w="570"/>
+            </w:r>
+            <w:r>
+              <w:br/>
+              <w:t>Dokumen Pendukung:</w:t>
+            </w:r>
+          </w:p>
+        </w:tc>
+      </w:tr>
+      <w:tr>
+        <w:tc>
+          <w:tcPr>
+            <w:tcW w:w="570" w:type="dxa"/>
           </w:tcPr>
           <w:p>
             <w:r>
@@ -2592,7 +2476,7 @@
         </w:tc>
         <w:tc>
           <w:tcPr>
-            <w:tcW w:type="dxa" w:w="1948"/>
+            <w:tcW w:w="1948" w:type="dxa"/>
           </w:tcPr>
           <w:p>
             <w:r>
@@ -2602,21 +2486,23 @@
         </w:tc>
         <w:tc>
           <w:tcPr>
-            <w:tcW w:type="dxa" w:w="6602"/>
+            <w:tcW w:w="6602" w:type="dxa"/>
           </w:tcPr>
           <w:p>
             <w:r>
               <w:t>Catatan: Instalasi driver grafis CUDA, cuDNN, serta library akselerasi deep learning dasar.</w:t>
-              <w:br/>
-              <w:t>Dokumen Pendukung:</w:t>
-            </w:r>
-          </w:p>
-        </w:tc>
-      </w:tr>
-      <w:tr>
-        <w:tc>
-          <w:tcPr>
-            <w:tcW w:type="dxa" w:w="570"/>
+            </w:r>
+            <w:r>
+              <w:br/>
+              <w:t>Dokumen Pendukung:</w:t>
+            </w:r>
+          </w:p>
+        </w:tc>
+      </w:tr>
+      <w:tr>
+        <w:tc>
+          <w:tcPr>
+            <w:tcW w:w="570" w:type="dxa"/>
           </w:tcPr>
           <w:p>
             <w:r>
@@ -2626,7 +2512,7 @@
         </w:tc>
         <w:tc>
           <w:tcPr>
-            <w:tcW w:type="dxa" w:w="1948"/>
+            <w:tcW w:w="1948" w:type="dxa"/>
           </w:tcPr>
           <w:p>
             <w:r>
@@ -2636,21 +2522,23 @@
         </w:tc>
         <w:tc>
           <w:tcPr>
-            <w:tcW w:type="dxa" w:w="6602"/>
+            <w:tcW w:w="6602" w:type="dxa"/>
           </w:tcPr>
           <w:p>
             <w:r>
               <w:t>Catatan: Pembuatan virtual environment Python terisolasi dan instalasi PyTorch ekosistem.</w:t>
-              <w:br/>
-              <w:t>Dokumen Pendukung:</w:t>
-            </w:r>
-          </w:p>
-        </w:tc>
-      </w:tr>
-      <w:tr>
-        <w:tc>
-          <w:tcPr>
-            <w:tcW w:type="dxa" w:w="570"/>
+            </w:r>
+            <w:r>
+              <w:br/>
+              <w:t>Dokumen Pendukung:</w:t>
+            </w:r>
+          </w:p>
+        </w:tc>
+      </w:tr>
+      <w:tr>
+        <w:tc>
+          <w:tcPr>
+            <w:tcW w:w="570" w:type="dxa"/>
           </w:tcPr>
           <w:p>
             <w:r>
@@ -2660,7 +2548,7 @@
         </w:tc>
         <w:tc>
           <w:tcPr>
-            <w:tcW w:type="dxa" w:w="1948"/>
+            <w:tcW w:w="1948" w:type="dxa"/>
           </w:tcPr>
           <w:p>
             <w:r>
@@ -2670,21 +2558,23 @@
         </w:tc>
         <w:tc>
           <w:tcPr>
-            <w:tcW w:type="dxa" w:w="6602"/>
+            <w:tcW w:w="6602" w:type="dxa"/>
           </w:tcPr>
           <w:p>
             <w:r>
               <w:t>Catatan: Konfigurasi akses sistem remote (Jupyter Lab / SSH) lalu verifikasi topologi GPU.</w:t>
-              <w:br/>
-              <w:t>Dokumen Pendukung:</w:t>
-            </w:r>
-          </w:p>
-        </w:tc>
-      </w:tr>
-      <w:tr>
-        <w:tc>
-          <w:tcPr>
-            <w:tcW w:type="dxa" w:w="570"/>
+            </w:r>
+            <w:r>
+              <w:br/>
+              <w:t>Dokumen Pendukung:</w:t>
+            </w:r>
+          </w:p>
+        </w:tc>
+      </w:tr>
+      <w:tr>
+        <w:tc>
+          <w:tcPr>
+            <w:tcW w:w="570" w:type="dxa"/>
           </w:tcPr>
           <w:p>
             <w:r>
@@ -2694,7 +2584,7 @@
         </w:tc>
         <w:tc>
           <w:tcPr>
-            <w:tcW w:type="dxa" w:w="1948"/>
+            <w:tcW w:w="1948" w:type="dxa"/>
           </w:tcPr>
           <w:p>
             <w:r>
@@ -2704,21 +2594,23 @@
         </w:tc>
         <w:tc>
           <w:tcPr>
-            <w:tcW w:type="dxa" w:w="6602"/>
+            <w:tcW w:w="6602" w:type="dxa"/>
           </w:tcPr>
           <w:p>
             <w:r>
               <w:t>Catatan: Uji coba pemuatan (loading) base model terkecil untuk memvalidasi kesiapan environment.</w:t>
-              <w:br/>
-              <w:t>Dokumen Pendukung:</w:t>
-            </w:r>
-          </w:p>
-        </w:tc>
-      </w:tr>
-      <w:tr>
-        <w:tc>
-          <w:tcPr>
-            <w:tcW w:type="dxa" w:w="570"/>
+            </w:r>
+            <w:r>
+              <w:br/>
+              <w:t>Dokumen Pendukung:</w:t>
+            </w:r>
+          </w:p>
+        </w:tc>
+      </w:tr>
+      <w:tr>
+        <w:tc>
+          <w:tcPr>
+            <w:tcW w:w="570" w:type="dxa"/>
           </w:tcPr>
           <w:p>
             <w:r>
@@ -2728,7 +2620,7 @@
         </w:tc>
         <w:tc>
           <w:tcPr>
-            <w:tcW w:type="dxa" w:w="1948"/>
+            <w:tcW w:w="1948" w:type="dxa"/>
           </w:tcPr>
           <w:p>
             <w:r>
@@ -2738,21 +2630,23 @@
         </w:tc>
         <w:tc>
           <w:tcPr>
-            <w:tcW w:type="dxa" w:w="6602"/>
+            <w:tcW w:w="6602" w:type="dxa"/>
           </w:tcPr>
           <w:p>
             <w:r>
               <w:t>Catatan: Desain dan kalibrasi prompt berbasis instruksi sistematis untuk tagging entitas.</w:t>
-              <w:br/>
-              <w:t>Dokumen Pendukung:</w:t>
-            </w:r>
-          </w:p>
-        </w:tc>
-      </w:tr>
-      <w:tr>
-        <w:tc>
-          <w:tcPr>
-            <w:tcW w:type="dxa" w:w="570"/>
+            </w:r>
+            <w:r>
+              <w:br/>
+              <w:t>Dokumen Pendukung:</w:t>
+            </w:r>
+          </w:p>
+        </w:tc>
+      </w:tr>
+      <w:tr>
+        <w:tc>
+          <w:tcPr>
+            <w:tcW w:w="570" w:type="dxa"/>
           </w:tcPr>
           <w:p>
             <w:r>
@@ -2762,7 +2656,7 @@
         </w:tc>
         <w:tc>
           <w:tcPr>
-            <w:tcW w:type="dxa" w:w="1948"/>
+            <w:tcW w:w="1948" w:type="dxa"/>
           </w:tcPr>
           <w:p>
             <w:r>
@@ -2772,21 +2666,23 @@
         </w:tc>
         <w:tc>
           <w:tcPr>
-            <w:tcW w:type="dxa" w:w="6602"/>
+            <w:tcW w:w="6602" w:type="dxa"/>
           </w:tcPr>
           <w:p>
             <w:r>
               <w:t>Catatan: Eksekusi uji coba inferensi kategorisasi konten dan metadata dengan Llama.</w:t>
-              <w:br/>
-              <w:t>Dokumen Pendukung:</w:t>
-            </w:r>
-          </w:p>
-        </w:tc>
-      </w:tr>
-      <w:tr>
-        <w:tc>
-          <w:tcPr>
-            <w:tcW w:type="dxa" w:w="570"/>
+            </w:r>
+            <w:r>
+              <w:br/>
+              <w:t>Dokumen Pendukung:</w:t>
+            </w:r>
+          </w:p>
+        </w:tc>
+      </w:tr>
+      <w:tr>
+        <w:tc>
+          <w:tcPr>
+            <w:tcW w:w="570" w:type="dxa"/>
           </w:tcPr>
           <w:p>
             <w:r>
@@ -2796,7 +2692,7 @@
         </w:tc>
         <w:tc>
           <w:tcPr>
-            <w:tcW w:type="dxa" w:w="1948"/>
+            <w:tcW w:w="1948" w:type="dxa"/>
           </w:tcPr>
           <w:p>
             <w:r>
@@ -2806,21 +2702,23 @@
         </w:tc>
         <w:tc>
           <w:tcPr>
-            <w:tcW w:type="dxa" w:w="6602"/>
+            <w:tcW w:w="6602" w:type="dxa"/>
           </w:tcPr>
           <w:p>
             <w:r>
               <w:t>Catatan: Evaluasi sebaran akurasi dan penyusunan matriks kebingungan (confusion matrix).</w:t>
-              <w:br/>
-              <w:t>Dokumen Pendukung:</w:t>
-            </w:r>
-          </w:p>
-        </w:tc>
-      </w:tr>
-      <w:tr>
-        <w:tc>
-          <w:tcPr>
-            <w:tcW w:type="dxa" w:w="570"/>
+            </w:r>
+            <w:r>
+              <w:br/>
+              <w:t>Dokumen Pendukung:</w:t>
+            </w:r>
+          </w:p>
+        </w:tc>
+      </w:tr>
+      <w:tr>
+        <w:tc>
+          <w:tcPr>
+            <w:tcW w:w="570" w:type="dxa"/>
           </w:tcPr>
           <w:p>
             <w:r>
@@ -2830,7 +2728,7 @@
         </w:tc>
         <w:tc>
           <w:tcPr>
-            <w:tcW w:type="dxa" w:w="1948"/>
+            <w:tcW w:w="1948" w:type="dxa"/>
           </w:tcPr>
           <w:p>
             <w:r>
@@ -2840,21 +2738,23 @@
         </w:tc>
         <w:tc>
           <w:tcPr>
-            <w:tcW w:type="dxa" w:w="6602"/>
+            <w:tcW w:w="6602" w:type="dxa"/>
           </w:tcPr>
           <w:p>
             <w:r>
               <w:t>Catatan: Refinement dan iterasi perbaikan prompt instruksi berdasarkan hasil log anomali.</w:t>
-              <w:br/>
-              <w:t>Dokumen Pendukung:</w:t>
-            </w:r>
-          </w:p>
-        </w:tc>
-      </w:tr>
-      <w:tr>
-        <w:tc>
-          <w:tcPr>
-            <w:tcW w:type="dxa" w:w="570"/>
+            </w:r>
+            <w:r>
+              <w:br/>
+              <w:t>Dokumen Pendukung:</w:t>
+            </w:r>
+          </w:p>
+        </w:tc>
+      </w:tr>
+      <w:tr>
+        <w:tc>
+          <w:tcPr>
+            <w:tcW w:w="570" w:type="dxa"/>
           </w:tcPr>
           <w:p>
             <w:r>
@@ -2864,7 +2764,7 @@
         </w:tc>
         <w:tc>
           <w:tcPr>
-            <w:tcW w:type="dxa" w:w="1948"/>
+            <w:tcW w:w="1948" w:type="dxa"/>
           </w:tcPr>
           <w:p>
             <w:r>
@@ -2874,21 +2774,23 @@
         </w:tc>
         <w:tc>
           <w:tcPr>
-            <w:tcW w:type="dxa" w:w="6602"/>
+            <w:tcW w:w="6602" w:type="dxa"/>
           </w:tcPr>
           <w:p>
             <w:r>
               <w:t>Catatan: Kompilasi ringkasan analisis kapabilitas analitis instruksional dari model Llama.</w:t>
-              <w:br/>
-              <w:t>Dokumen Pendukung:</w:t>
-            </w:r>
-          </w:p>
-        </w:tc>
-      </w:tr>
-      <w:tr>
-        <w:tc>
-          <w:tcPr>
-            <w:tcW w:type="dxa" w:w="570"/>
+            </w:r>
+            <w:r>
+              <w:br/>
+              <w:t>Dokumen Pendukung:</w:t>
+            </w:r>
+          </w:p>
+        </w:tc>
+      </w:tr>
+      <w:tr>
+        <w:tc>
+          <w:tcPr>
+            <w:tcW w:w="570" w:type="dxa"/>
           </w:tcPr>
           <w:p>
             <w:r>
@@ -2898,7 +2800,7 @@
         </w:tc>
         <w:tc>
           <w:tcPr>
-            <w:tcW w:type="dxa" w:w="1948"/>
+            <w:tcW w:w="1948" w:type="dxa"/>
           </w:tcPr>
           <w:p>
             <w:r>
@@ -2908,21 +2810,23 @@
         </w:tc>
         <w:tc>
           <w:tcPr>
-            <w:tcW w:type="dxa" w:w="6602"/>
+            <w:tcW w:w="6602" w:type="dxa"/>
           </w:tcPr>
           <w:p>
             <w:r>
               <w:t>Catatan: Studi literatur terkait algoritma manajemen memori GPU dan dokumentasi paket Unsloth.</w:t>
-              <w:br/>
-              <w:t>Dokumen Pendukung:</w:t>
-            </w:r>
-          </w:p>
-        </w:tc>
-      </w:tr>
-      <w:tr>
-        <w:tc>
-          <w:tcPr>
-            <w:tcW w:type="dxa" w:w="570"/>
+            </w:r>
+            <w:r>
+              <w:br/>
+              <w:t>Dokumen Pendukung:</w:t>
+            </w:r>
+          </w:p>
+        </w:tc>
+      </w:tr>
+      <w:tr>
+        <w:tc>
+          <w:tcPr>
+            <w:tcW w:w="570" w:type="dxa"/>
           </w:tcPr>
           <w:p>
             <w:r>
@@ -2932,7 +2836,7 @@
         </w:tc>
         <w:tc>
           <w:tcPr>
-            <w:tcW w:type="dxa" w:w="1948"/>
+            <w:tcW w:w="1948" w:type="dxa"/>
           </w:tcPr>
           <w:p>
             <w:r>
@@ -2942,31 +2846,34 @@
         </w:tc>
         <w:tc>
           <w:tcPr>
-            <w:tcW w:type="dxa" w:w="6602"/>
+            <w:tcW w:w="6602" w:type="dxa"/>
           </w:tcPr>
           <w:p>
             <w:r>
               <w:t>Catatan: Instalasi paket Unsloth dan library pendukung efisiensi (trl, peft) pada server.</w:t>
-              <w:br/>
-              <w:t>Dokumen Pendukung:</w:t>
-            </w:r>
-          </w:p>
-        </w:tc>
-      </w:tr>
-      <w:tr>
-        <w:tc>
-          <w:tcPr>
-            <w:tcW w:type="dxa" w:w="570"/>
-          </w:tcPr>
-          <w:p>
-            <w:r>
+            </w:r>
+            <w:r>
+              <w:br/>
+              <w:t>Dokumen Pendukung:</w:t>
+            </w:r>
+          </w:p>
+        </w:tc>
+      </w:tr>
+      <w:tr>
+        <w:tc>
+          <w:tcPr>
+            <w:tcW w:w="570" w:type="dxa"/>
+          </w:tcPr>
+          <w:p>
+            <w:r>
+              <w:lastRenderedPageBreak/>
               <w:t>48</w:t>
             </w:r>
           </w:p>
         </w:tc>
         <w:tc>
           <w:tcPr>
-            <w:tcW w:type="dxa" w:w="1948"/>
+            <w:tcW w:w="1948" w:type="dxa"/>
           </w:tcPr>
           <w:p>
             <w:r>
@@ -2976,21 +2883,23 @@
         </w:tc>
         <w:tc>
           <w:tcPr>
-            <w:tcW w:type="dxa" w:w="6602"/>
+            <w:tcW w:w="6602" w:type="dxa"/>
           </w:tcPr>
           <w:p>
             <w:r>
               <w:t>Catatan: Uji beban dan profiling baseline beban VRAM pada skrip training standar non-Unsloth.</w:t>
-              <w:br/>
-              <w:t>Dokumen Pendukung:</w:t>
-            </w:r>
-          </w:p>
-        </w:tc>
-      </w:tr>
-      <w:tr>
-        <w:tc>
-          <w:tcPr>
-            <w:tcW w:type="dxa" w:w="570"/>
+            </w:r>
+            <w:r>
+              <w:br/>
+              <w:t>Dokumen Pendukung:</w:t>
+            </w:r>
+          </w:p>
+        </w:tc>
+      </w:tr>
+      <w:tr>
+        <w:tc>
+          <w:tcPr>
+            <w:tcW w:w="570" w:type="dxa"/>
           </w:tcPr>
           <w:p>
             <w:r>
@@ -3000,7 +2909,7 @@
         </w:tc>
         <w:tc>
           <w:tcPr>
-            <w:tcW w:type="dxa" w:w="1948"/>
+            <w:tcW w:w="1948" w:type="dxa"/>
           </w:tcPr>
           <w:p>
             <w:r>
@@ -3010,21 +2919,23 @@
         </w:tc>
         <w:tc>
           <w:tcPr>
-            <w:tcW w:type="dxa" w:w="6602"/>
+            <w:tcW w:w="6602" w:type="dxa"/>
           </w:tcPr>
           <w:p>
             <w:r>
               <w:t>Catatan: Migrasi skrip proses training dasar agar sepenuhnya mendukung eksekusi Unsloth.</w:t>
-              <w:br/>
-              <w:t>Dokumen Pendukung:</w:t>
-            </w:r>
-          </w:p>
-        </w:tc>
-      </w:tr>
-      <w:tr>
-        <w:tc>
-          <w:tcPr>
-            <w:tcW w:type="dxa" w:w="570"/>
+            </w:r>
+            <w:r>
+              <w:br/>
+              <w:t>Dokumen Pendukung:</w:t>
+            </w:r>
+          </w:p>
+        </w:tc>
+      </w:tr>
+      <w:tr>
+        <w:tc>
+          <w:tcPr>
+            <w:tcW w:w="570" w:type="dxa"/>
           </w:tcPr>
           <w:p>
             <w:r>
@@ -3034,7 +2945,7 @@
         </w:tc>
         <w:tc>
           <w:tcPr>
-            <w:tcW w:type="dxa" w:w="1948"/>
+            <w:tcW w:w="1948" w:type="dxa"/>
           </w:tcPr>
           <w:p>
             <w:r>
@@ -3044,21 +2955,23 @@
         </w:tc>
         <w:tc>
           <w:tcPr>
-            <w:tcW w:type="dxa" w:w="6602"/>
+            <w:tcW w:w="6602" w:type="dxa"/>
           </w:tcPr>
           <w:p>
             <w:r>
               <w:t>Catatan: Benchmarking efisiensi utilisasi VRAM serta komparasi laju iterasi (waktu eksekusi).</w:t>
-              <w:br/>
-              <w:t>Dokumen Pendukung:</w:t>
-            </w:r>
-          </w:p>
-        </w:tc>
-      </w:tr>
-      <w:tr>
-        <w:tc>
-          <w:tcPr>
-            <w:tcW w:type="dxa" w:w="570"/>
+            </w:r>
+            <w:r>
+              <w:br/>
+              <w:t>Dokumen Pendukung:</w:t>
+            </w:r>
+          </w:p>
+        </w:tc>
+      </w:tr>
+      <w:tr>
+        <w:tc>
+          <w:tcPr>
+            <w:tcW w:w="570" w:type="dxa"/>
           </w:tcPr>
           <w:p>
             <w:r>
@@ -3068,7 +2981,7 @@
         </w:tc>
         <w:tc>
           <w:tcPr>
-            <w:tcW w:type="dxa" w:w="1948"/>
+            <w:tcW w:w="1948" w:type="dxa"/>
           </w:tcPr>
           <w:p>
             <w:r>
@@ -3078,21 +2991,23 @@
         </w:tc>
         <w:tc>
           <w:tcPr>
-            <w:tcW w:type="dxa" w:w="6602"/>
+            <w:tcW w:w="6602" w:type="dxa"/>
           </w:tcPr>
           <w:p>
             <w:r>
               <w:t>Catatan: Pemrograman skema perancangan konfigurasi LoRA (pemilihan ukuran Rank dan Alpha).</w:t>
-              <w:br/>
-              <w:t>Dokumen Pendukung:</w:t>
-            </w:r>
-          </w:p>
-        </w:tc>
-      </w:tr>
-      <w:tr>
-        <w:tc>
-          <w:tcPr>
-            <w:tcW w:type="dxa" w:w="570"/>
+            </w:r>
+            <w:r>
+              <w:br/>
+              <w:t>Dokumen Pendukung:</w:t>
+            </w:r>
+          </w:p>
+        </w:tc>
+      </w:tr>
+      <w:tr>
+        <w:tc>
+          <w:tcPr>
+            <w:tcW w:w="570" w:type="dxa"/>
           </w:tcPr>
           <w:p>
             <w:r>
@@ -3102,7 +3017,7 @@
         </w:tc>
         <w:tc>
           <w:tcPr>
-            <w:tcW w:type="dxa" w:w="1948"/>
+            <w:tcW w:w="1948" w:type="dxa"/>
           </w:tcPr>
           <w:p>
             <w:r>
@@ -3112,21 +3027,23 @@
         </w:tc>
         <w:tc>
           <w:tcPr>
-            <w:tcW w:type="dxa" w:w="6602"/>
+            <w:tcW w:w="6602" w:type="dxa"/>
           </w:tcPr>
           <w:p>
             <w:r>
               <w:t>Catatan: Penyiapan integrasi algoritma kuantisasi 4-bit (QLoRA) mempergunakan BitsAndBytes.</w:t>
-              <w:br/>
-              <w:t>Dokumen Pendukung:</w:t>
-            </w:r>
-          </w:p>
-        </w:tc>
-      </w:tr>
-      <w:tr>
-        <w:tc>
-          <w:tcPr>
-            <w:tcW w:type="dxa" w:w="570"/>
+            </w:r>
+            <w:r>
+              <w:br/>
+              <w:t>Dokumen Pendukung:</w:t>
+            </w:r>
+          </w:p>
+        </w:tc>
+      </w:tr>
+      <w:tr>
+        <w:tc>
+          <w:tcPr>
+            <w:tcW w:w="570" w:type="dxa"/>
           </w:tcPr>
           <w:p>
             <w:r>
@@ -3136,7 +3053,7 @@
         </w:tc>
         <w:tc>
           <w:tcPr>
-            <w:tcW w:type="dxa" w:w="1948"/>
+            <w:tcW w:w="1948" w:type="dxa"/>
           </w:tcPr>
           <w:p>
             <w:r>
@@ -3146,21 +3063,23 @@
         </w:tc>
         <w:tc>
           <w:tcPr>
-            <w:tcW w:type="dxa" w:w="6602"/>
+            <w:tcW w:w="6602" w:type="dxa"/>
           </w:tcPr>
           <w:p>
             <w:r>
               <w:t>Catatan: Uji coba iterasi periode pertama proses Parameter-Efficient Fine-Tuning pada subset data.</w:t>
-              <w:br/>
-              <w:t>Dokumen Pendukung:</w:t>
-            </w:r>
-          </w:p>
-        </w:tc>
-      </w:tr>
-      <w:tr>
-        <w:tc>
-          <w:tcPr>
-            <w:tcW w:type="dxa" w:w="570"/>
+            </w:r>
+            <w:r>
+              <w:br/>
+              <w:t>Dokumen Pendukung:</w:t>
+            </w:r>
+          </w:p>
+        </w:tc>
+      </w:tr>
+      <w:tr>
+        <w:tc>
+          <w:tcPr>
+            <w:tcW w:w="570" w:type="dxa"/>
           </w:tcPr>
           <w:p>
             <w:r>
@@ -3170,7 +3089,7 @@
         </w:tc>
         <w:tc>
           <w:tcPr>
-            <w:tcW w:type="dxa" w:w="1948"/>
+            <w:tcW w:w="1948" w:type="dxa"/>
           </w:tcPr>
           <w:p>
             <w:r>
@@ -3180,21 +3099,23 @@
         </w:tc>
         <w:tc>
           <w:tcPr>
-            <w:tcW w:type="dxa" w:w="6602"/>
+            <w:tcW w:w="6602" w:type="dxa"/>
           </w:tcPr>
           <w:p>
             <w:r>
               <w:t>Catatan: Monitoring kestabilan gradien, laju optimisasi, dan kurva loss (training/validation).</w:t>
-              <w:br/>
-              <w:t>Dokumen Pendukung:</w:t>
-            </w:r>
-          </w:p>
-        </w:tc>
-      </w:tr>
-      <w:tr>
-        <w:tc>
-          <w:tcPr>
-            <w:tcW w:type="dxa" w:w="570"/>
+            </w:r>
+            <w:r>
+              <w:br/>
+              <w:t>Dokumen Pendukung:</w:t>
+            </w:r>
+          </w:p>
+        </w:tc>
+      </w:tr>
+      <w:tr>
+        <w:tc>
+          <w:tcPr>
+            <w:tcW w:w="570" w:type="dxa"/>
           </w:tcPr>
           <w:p>
             <w:r>
@@ -3204,7 +3125,7 @@
         </w:tc>
         <w:tc>
           <w:tcPr>
-            <w:tcW w:type="dxa" w:w="1948"/>
+            <w:tcW w:w="1948" w:type="dxa"/>
           </w:tcPr>
           <w:p>
             <w:r>
@@ -3214,21 +3135,23 @@
         </w:tc>
         <w:tc>
           <w:tcPr>
-            <w:tcW w:type="dxa" w:w="6602"/>
+            <w:tcW w:w="6602" w:type="dxa"/>
           </w:tcPr>
           <w:p>
             <w:r>
               <w:t>Catatan: Pengujian stabilitas inferensi awal menggunakan adapter pasca-PEFT demi menghindari degradasi.</w:t>
-              <w:br/>
-              <w:t>Dokumen Pendukung:</w:t>
-            </w:r>
-          </w:p>
-        </w:tc>
-      </w:tr>
-      <w:tr>
-        <w:tc>
-          <w:tcPr>
-            <w:tcW w:type="dxa" w:w="570"/>
+            </w:r>
+            <w:r>
+              <w:br/>
+              <w:t>Dokumen Pendukung:</w:t>
+            </w:r>
+          </w:p>
+        </w:tc>
+      </w:tr>
+      <w:tr>
+        <w:tc>
+          <w:tcPr>
+            <w:tcW w:w="570" w:type="dxa"/>
           </w:tcPr>
           <w:p>
             <w:r>
@@ -3238,7 +3161,7 @@
         </w:tc>
         <w:tc>
           <w:tcPr>
-            <w:tcW w:type="dxa" w:w="1948"/>
+            <w:tcW w:w="1948" w:type="dxa"/>
           </w:tcPr>
           <w:p>
             <w:r>
@@ -3248,21 +3171,23 @@
         </w:tc>
         <w:tc>
           <w:tcPr>
-            <w:tcW w:type="dxa" w:w="6602"/>
+            <w:tcW w:w="6602" w:type="dxa"/>
           </w:tcPr>
           <w:p>
             <w:r>
               <w:t>Catatan: Studi karakteristik arsitektur ultra-mini dan keterbatasan operasional dari Gemma 3 270M.</w:t>
-              <w:br/>
-              <w:t>Dokumen Pendukung:</w:t>
-            </w:r>
-          </w:p>
-        </w:tc>
-      </w:tr>
-      <w:tr>
-        <w:tc>
-          <w:tcPr>
-            <w:tcW w:type="dxa" w:w="570"/>
+            </w:r>
+            <w:r>
+              <w:br/>
+              <w:t>Dokumen Pendukung:</w:t>
+            </w:r>
+          </w:p>
+        </w:tc>
+      </w:tr>
+      <w:tr>
+        <w:tc>
+          <w:tcPr>
+            <w:tcW w:w="570" w:type="dxa"/>
           </w:tcPr>
           <w:p>
             <w:r>
@@ -3272,7 +3197,7 @@
         </w:tc>
         <w:tc>
           <w:tcPr>
-            <w:tcW w:type="dxa" w:w="1948"/>
+            <w:tcW w:w="1948" w:type="dxa"/>
           </w:tcPr>
           <w:p>
             <w:r>
@@ -3282,21 +3207,23 @@
         </w:tc>
         <w:tc>
           <w:tcPr>
-            <w:tcW w:type="dxa" w:w="6602"/>
+            <w:tcW w:w="6602" w:type="dxa"/>
           </w:tcPr>
           <w:p>
             <w:r>
               <w:t>Catatan: Penyesuaian konfigurasi hyperparameter training yang dikalibrasi untuk dimensi model sub-1B.</w:t>
-              <w:br/>
-              <w:t>Dokumen Pendukung:</w:t>
-            </w:r>
-          </w:p>
-        </w:tc>
-      </w:tr>
-      <w:tr>
-        <w:tc>
-          <w:tcPr>
-            <w:tcW w:type="dxa" w:w="570"/>
+            </w:r>
+            <w:r>
+              <w:br/>
+              <w:t>Dokumen Pendukung:</w:t>
+            </w:r>
+          </w:p>
+        </w:tc>
+      </w:tr>
+      <w:tr>
+        <w:tc>
+          <w:tcPr>
+            <w:tcW w:w="570" w:type="dxa"/>
           </w:tcPr>
           <w:p>
             <w:r>
@@ -3306,7 +3233,7 @@
         </w:tc>
         <w:tc>
           <w:tcPr>
-            <w:tcW w:type="dxa" w:w="1948"/>
+            <w:tcW w:w="1948" w:type="dxa"/>
           </w:tcPr>
           <w:p>
             <w:r>
@@ -3316,21 +3243,23 @@
         </w:tc>
         <w:tc>
           <w:tcPr>
-            <w:tcW w:type="dxa" w:w="6602"/>
+            <w:tcW w:w="6602" w:type="dxa"/>
           </w:tcPr>
           <w:p>
             <w:r>
               <w:t>Catatan: Uji coba pelaksanaan fine-tuning tahap pertama secara eksklusif untuk model 270M.</w:t>
-              <w:br/>
-              <w:t>Dokumen Pendukung:</w:t>
-            </w:r>
-          </w:p>
-        </w:tc>
-      </w:tr>
-      <w:tr>
-        <w:tc>
-          <w:tcPr>
-            <w:tcW w:type="dxa" w:w="570"/>
+            </w:r>
+            <w:r>
+              <w:br/>
+              <w:t>Dokumen Pendukung:</w:t>
+            </w:r>
+          </w:p>
+        </w:tc>
+      </w:tr>
+      <w:tr>
+        <w:tc>
+          <w:tcPr>
+            <w:tcW w:w="570" w:type="dxa"/>
           </w:tcPr>
           <w:p>
             <w:r>
@@ -3340,7 +3269,7 @@
         </w:tc>
         <w:tc>
           <w:tcPr>
-            <w:tcW w:type="dxa" w:w="1948"/>
+            <w:tcW w:w="1948" w:type="dxa"/>
           </w:tcPr>
           <w:p>
             <w:r>
@@ -3350,21 +3279,23 @@
         </w:tc>
         <w:tc>
           <w:tcPr>
-            <w:tcW w:type="dxa" w:w="6602"/>
+            <w:tcW w:w="6602" w:type="dxa"/>
           </w:tcPr>
           <w:p>
             <w:r>
               <w:t>Catatan: Evaluasi perbedaan kinerja base model dibandingkan dengan checkpoint hasil fine-tuned.</w:t>
-              <w:br/>
-              <w:t>Dokumen Pendukung:</w:t>
-            </w:r>
-          </w:p>
-        </w:tc>
-      </w:tr>
-      <w:tr>
-        <w:tc>
-          <w:tcPr>
-            <w:tcW w:type="dxa" w:w="570"/>
+            </w:r>
+            <w:r>
+              <w:br/>
+              <w:t>Dokumen Pendukung:</w:t>
+            </w:r>
+          </w:p>
+        </w:tc>
+      </w:tr>
+      <w:tr>
+        <w:tc>
+          <w:tcPr>
+            <w:tcW w:w="570" w:type="dxa"/>
           </w:tcPr>
           <w:p>
             <w:r>
@@ -3374,7 +3305,7 @@
         </w:tc>
         <w:tc>
           <w:tcPr>
-            <w:tcW w:type="dxa" w:w="1948"/>
+            <w:tcW w:w="1948" w:type="dxa"/>
           </w:tcPr>
           <w:p>
             <w:r>
@@ -3384,21 +3315,23 @@
         </w:tc>
         <w:tc>
           <w:tcPr>
-            <w:tcW w:type="dxa" w:w="6602"/>
+            <w:tcW w:w="6602" w:type="dxa"/>
           </w:tcPr>
           <w:p>
             <w:r>
               <w:t>Catatan: Penyusunan proyeksi pengujian lingkungan dan skenario simulasi deployment minim resource.</w:t>
-              <w:br/>
-              <w:t>Dokumen Pendukung:</w:t>
-            </w:r>
-          </w:p>
-        </w:tc>
-      </w:tr>
-      <w:tr>
-        <w:tc>
-          <w:tcPr>
-            <w:tcW w:type="dxa" w:w="570"/>
+            </w:r>
+            <w:r>
+              <w:br/>
+              <w:t>Dokumen Pendukung:</w:t>
+            </w:r>
+          </w:p>
+        </w:tc>
+      </w:tr>
+      <w:tr>
+        <w:tc>
+          <w:tcPr>
+            <w:tcW w:w="570" w:type="dxa"/>
           </w:tcPr>
           <w:p>
             <w:r>
@@ -3408,7 +3341,7 @@
         </w:tc>
         <w:tc>
           <w:tcPr>
-            <w:tcW w:type="dxa" w:w="1948"/>
+            <w:tcW w:w="1948" w:type="dxa"/>
           </w:tcPr>
           <w:p>
             <w:r>
@@ -3418,21 +3351,23 @@
         </w:tc>
         <w:tc>
           <w:tcPr>
-            <w:tcW w:type="dxa" w:w="6602"/>
+            <w:tcW w:w="6602" w:type="dxa"/>
           </w:tcPr>
           <w:p>
             <w:r>
               <w:t>Catatan: Audit ekstensif arsitektur program dan identifikasi limitasi basis kode monolithic saat ini.</w:t>
-              <w:br/>
-              <w:t>Dokumen Pendukung:</w:t>
-            </w:r>
-          </w:p>
-        </w:tc>
-      </w:tr>
-      <w:tr>
-        <w:tc>
-          <w:tcPr>
-            <w:tcW w:type="dxa" w:w="570"/>
+            </w:r>
+            <w:r>
+              <w:br/>
+              <w:t>Dokumen Pendukung:</w:t>
+            </w:r>
+          </w:p>
+        </w:tc>
+      </w:tr>
+      <w:tr>
+        <w:tc>
+          <w:tcPr>
+            <w:tcW w:w="570" w:type="dxa"/>
           </w:tcPr>
           <w:p>
             <w:r>
@@ -3442,7 +3377,7 @@
         </w:tc>
         <w:tc>
           <w:tcPr>
-            <w:tcW w:type="dxa" w:w="1948"/>
+            <w:tcW w:w="1948" w:type="dxa"/>
           </w:tcPr>
           <w:p>
             <w:r>
@@ -3452,21 +3387,23 @@
         </w:tc>
         <w:tc>
           <w:tcPr>
-            <w:tcW w:type="dxa" w:w="6602"/>
+            <w:tcW w:w="6602" w:type="dxa"/>
           </w:tcPr>
           <w:p>
             <w:r>
               <w:t>Catatan: Pemecahan struktur pipeline agen-agen eksisting menjadi class dan sub-modul yang independen.</w:t>
-              <w:br/>
-              <w:t>Dokumen Pendukung:</w:t>
-            </w:r>
-          </w:p>
-        </w:tc>
-      </w:tr>
-      <w:tr>
-        <w:tc>
-          <w:tcPr>
-            <w:tcW w:type="dxa" w:w="570"/>
+            </w:r>
+            <w:r>
+              <w:br/>
+              <w:t>Dokumen Pendukung:</w:t>
+            </w:r>
+          </w:p>
+        </w:tc>
+      </w:tr>
+      <w:tr>
+        <w:tc>
+          <w:tcPr>
+            <w:tcW w:w="570" w:type="dxa"/>
           </w:tcPr>
           <w:p>
             <w:r>
@@ -3476,7 +3413,7 @@
         </w:tc>
         <w:tc>
           <w:tcPr>
-            <w:tcW w:type="dxa" w:w="1948"/>
+            <w:tcW w:w="1948" w:type="dxa"/>
           </w:tcPr>
           <w:p>
             <w:r>
@@ -3486,31 +3423,34 @@
         </w:tc>
         <w:tc>
           <w:tcPr>
-            <w:tcW w:type="dxa" w:w="6602"/>
+            <w:tcW w:w="6602" w:type="dxa"/>
           </w:tcPr>
           <w:p>
             <w:r>
               <w:t>Catatan: Refaktorisasi pola pengendalian state (state-management) memanfaatkan LangChain StateGraph.</w:t>
-              <w:br/>
-              <w:t>Dokumen Pendukung:</w:t>
-            </w:r>
-          </w:p>
-        </w:tc>
-      </w:tr>
-      <w:tr>
-        <w:tc>
-          <w:tcPr>
-            <w:tcW w:type="dxa" w:w="570"/>
-          </w:tcPr>
-          <w:p>
-            <w:r>
+            </w:r>
+            <w:r>
+              <w:br/>
+              <w:t>Dokumen Pendukung:</w:t>
+            </w:r>
+          </w:p>
+        </w:tc>
+      </w:tr>
+      <w:tr>
+        <w:tc>
+          <w:tcPr>
+            <w:tcW w:w="570" w:type="dxa"/>
+          </w:tcPr>
+          <w:p>
+            <w:r>
+              <w:lastRenderedPageBreak/>
               <w:t>64</w:t>
             </w:r>
           </w:p>
         </w:tc>
         <w:tc>
           <w:tcPr>
-            <w:tcW w:type="dxa" w:w="1948"/>
+            <w:tcW w:w="1948" w:type="dxa"/>
           </w:tcPr>
           <w:p>
             <w:r>
@@ -3520,21 +3460,23 @@
         </w:tc>
         <w:tc>
           <w:tcPr>
-            <w:tcW w:type="dxa" w:w="6602"/>
+            <w:tcW w:w="6602" w:type="dxa"/>
           </w:tcPr>
           <w:p>
             <w:r>
               <w:t>Catatan: Penyesuaian dependensi pemanggilan internal dan integrasi direktori kerja baru 'langchain-refactor'.</w:t>
-              <w:br/>
-              <w:t>Dokumen Pendukung:</w:t>
-            </w:r>
-          </w:p>
-        </w:tc>
-      </w:tr>
-      <w:tr>
-        <w:tc>
-          <w:tcPr>
-            <w:tcW w:type="dxa" w:w="570"/>
+            </w:r>
+            <w:r>
+              <w:br/>
+              <w:t>Dokumen Pendukung:</w:t>
+            </w:r>
+          </w:p>
+        </w:tc>
+      </w:tr>
+      <w:tr>
+        <w:tc>
+          <w:tcPr>
+            <w:tcW w:w="570" w:type="dxa"/>
           </w:tcPr>
           <w:p>
             <w:r>
@@ -3544,7 +3486,7 @@
         </w:tc>
         <w:tc>
           <w:tcPr>
-            <w:tcW w:type="dxa" w:w="1948"/>
+            <w:tcW w:w="1948" w:type="dxa"/>
           </w:tcPr>
           <w:p>
             <w:r>
@@ -3554,21 +3496,23 @@
         </w:tc>
         <w:tc>
           <w:tcPr>
-            <w:tcW w:type="dxa" w:w="6602"/>
+            <w:tcW w:w="6602" w:type="dxa"/>
           </w:tcPr>
           <w:p>
             <w:r>
               <w:t>Catatan: Pelaksanaan uji fungsi menyeluruh (end-to-end regression) untuk konfirmasi fungsionalitas sistem.</w:t>
-              <w:br/>
-              <w:t>Dokumen Pendukung:</w:t>
-            </w:r>
-          </w:p>
-        </w:tc>
-      </w:tr>
-      <w:tr>
-        <w:tc>
-          <w:tcPr>
-            <w:tcW w:type="dxa" w:w="570"/>
+            </w:r>
+            <w:r>
+              <w:br/>
+              <w:t>Dokumen Pendukung:</w:t>
+            </w:r>
+          </w:p>
+        </w:tc>
+      </w:tr>
+      <w:tr>
+        <w:tc>
+          <w:tcPr>
+            <w:tcW w:w="570" w:type="dxa"/>
           </w:tcPr>
           <w:p>
             <w:r>
@@ -3578,7 +3522,7 @@
         </w:tc>
         <w:tc>
           <w:tcPr>
-            <w:tcW w:type="dxa" w:w="1948"/>
+            <w:tcW w:w="1948" w:type="dxa"/>
           </w:tcPr>
           <w:p>
             <w:r>
@@ -3588,21 +3532,23 @@
         </w:tc>
         <w:tc>
           <w:tcPr>
-            <w:tcW w:type="dxa" w:w="6602"/>
+            <w:tcW w:w="6602" w:type="dxa"/>
           </w:tcPr>
           <w:p>
             <w:r>
               <w:t>Catatan: Analisis performa degradatif model Gemma 3 270M atas penurunan akurasi pada evaluasi Phase 3.</w:t>
-              <w:br/>
-              <w:t>Dokumen Pendukung:</w:t>
-            </w:r>
-          </w:p>
-        </w:tc>
-      </w:tr>
-      <w:tr>
-        <w:tc>
-          <w:tcPr>
-            <w:tcW w:type="dxa" w:w="570"/>
+            </w:r>
+            <w:r>
+              <w:br/>
+              <w:t>Dokumen Pendukung:</w:t>
+            </w:r>
+          </w:p>
+        </w:tc>
+      </w:tr>
+      <w:tr>
+        <w:tc>
+          <w:tcPr>
+            <w:tcW w:w="570" w:type="dxa"/>
           </w:tcPr>
           <w:p>
             <w:r>
@@ -3612,7 +3558,7 @@
         </w:tc>
         <w:tc>
           <w:tcPr>
-            <w:tcW w:type="dxa" w:w="1948"/>
+            <w:tcW w:w="1948" w:type="dxa"/>
           </w:tcPr>
           <w:p>
             <w:r>
@@ -3622,21 +3568,23 @@
         </w:tc>
         <w:tc>
           <w:tcPr>
-            <w:tcW w:type="dxa" w:w="6602"/>
+            <w:tcW w:w="6602" w:type="dxa"/>
           </w:tcPr>
           <w:p>
             <w:r>
               <w:t>Catatan: Inspeksi mendetail terhadap keluaran prediksi yang mengungkap disrupsi integritas parsing format JSON.</w:t>
-              <w:br/>
-              <w:t>Dokumen Pendukung:</w:t>
-            </w:r>
-          </w:p>
-        </w:tc>
-      </w:tr>
-      <w:tr>
-        <w:tc>
-          <w:tcPr>
-            <w:tcW w:type="dxa" w:w="570"/>
+            </w:r>
+            <w:r>
+              <w:br/>
+              <w:t>Dokumen Pendukung:</w:t>
+            </w:r>
+          </w:p>
+        </w:tc>
+      </w:tr>
+      <w:tr>
+        <w:tc>
+          <w:tcPr>
+            <w:tcW w:w="570" w:type="dxa"/>
           </w:tcPr>
           <w:p>
             <w:r>
@@ -3646,7 +3594,7 @@
         </w:tc>
         <w:tc>
           <w:tcPr>
-            <w:tcW w:type="dxa" w:w="1948"/>
+            <w:tcW w:w="1948" w:type="dxa"/>
           </w:tcPr>
           <w:p>
             <w:r>
@@ -3656,21 +3604,23 @@
         </w:tc>
         <w:tc>
           <w:tcPr>
-            <w:tcW w:type="dxa" w:w="6602"/>
+            <w:tcW w:w="6602" w:type="dxa"/>
           </w:tcPr>
           <w:p>
             <w:r>
               <w:t>Catatan: Investigasi teoritis relasi antara struktur kendala skema output JSON dengan parameter berkapasitas rendah.</w:t>
-              <w:br/>
-              <w:t>Dokumen Pendukung:</w:t>
-            </w:r>
-          </w:p>
-        </w:tc>
-      </w:tr>
-      <w:tr>
-        <w:tc>
-          <w:tcPr>
-            <w:tcW w:type="dxa" w:w="570"/>
+            </w:r>
+            <w:r>
+              <w:br/>
+              <w:t>Dokumen Pendukung:</w:t>
+            </w:r>
+          </w:p>
+        </w:tc>
+      </w:tr>
+      <w:tr>
+        <w:tc>
+          <w:tcPr>
+            <w:tcW w:w="570" w:type="dxa"/>
           </w:tcPr>
           <w:p>
             <w:r>
@@ -3680,7 +3630,7 @@
         </w:tc>
         <w:tc>
           <w:tcPr>
-            <w:tcW w:type="dxa" w:w="1948"/>
+            <w:tcW w:w="1948" w:type="dxa"/>
           </w:tcPr>
           <w:p>
             <w:r>
@@ -3690,21 +3640,23 @@
         </w:tc>
         <w:tc>
           <w:tcPr>
-            <w:tcW w:type="dxa" w:w="6602"/>
+            <w:tcW w:w="6602" w:type="dxa"/>
           </w:tcPr>
           <w:p>
             <w:r>
               <w:t>Catatan: Eksperimentasi penyesuaian instruksi constraint JSON dengan harapan meringankan overhead generasi SLM.</w:t>
-              <w:br/>
-              <w:t>Dokumen Pendukung:</w:t>
-            </w:r>
-          </w:p>
-        </w:tc>
-      </w:tr>
-      <w:tr>
-        <w:tc>
-          <w:tcPr>
-            <w:tcW w:type="dxa" w:w="570"/>
+            </w:r>
+            <w:r>
+              <w:br/>
+              <w:t>Dokumen Pendukung:</w:t>
+            </w:r>
+          </w:p>
+        </w:tc>
+      </w:tr>
+      <w:tr>
+        <w:tc>
+          <w:tcPr>
+            <w:tcW w:w="570" w:type="dxa"/>
           </w:tcPr>
           <w:p>
             <w:r>
@@ -3714,7 +3666,7 @@
         </w:tc>
         <w:tc>
           <w:tcPr>
-            <w:tcW w:type="dxa" w:w="1948"/>
+            <w:tcW w:w="1948" w:type="dxa"/>
           </w:tcPr>
           <w:p>
             <w:r>
@@ -3724,21 +3676,23 @@
         </w:tc>
         <w:tc>
           <w:tcPr>
-            <w:tcW w:type="dxa" w:w="6602"/>
+            <w:tcW w:w="6602" w:type="dxa"/>
           </w:tcPr>
           <w:p>
             <w:r>
               <w:t>Catatan: Formulasi kesimpulan terkait insufisiensi kemampuan format logika terstruktur pada rentang Small Language Models.</w:t>
-              <w:br/>
-              <w:t>Dokumen Pendukung:</w:t>
-            </w:r>
-          </w:p>
-        </w:tc>
-      </w:tr>
-      <w:tr>
-        <w:tc>
-          <w:tcPr>
-            <w:tcW w:type="dxa" w:w="570"/>
+            </w:r>
+            <w:r>
+              <w:br/>
+              <w:t>Dokumen Pendukung:</w:t>
+            </w:r>
+          </w:p>
+        </w:tc>
+      </w:tr>
+      <w:tr>
+        <w:tc>
+          <w:tcPr>
+            <w:tcW w:w="570" w:type="dxa"/>
           </w:tcPr>
           <w:p>
             <w:r>
@@ -3748,7 +3702,7 @@
         </w:tc>
         <w:tc>
           <w:tcPr>
-            <w:tcW w:type="dxa" w:w="1948"/>
+            <w:tcW w:w="1948" w:type="dxa"/>
           </w:tcPr>
           <w:p>
             <w:r>
@@ -3758,21 +3712,23 @@
         </w:tc>
         <w:tc>
           <w:tcPr>
-            <w:tcW w:type="dxa" w:w="6602"/>
+            <w:tcW w:w="6602" w:type="dxa"/>
           </w:tcPr>
           <w:p>
             <w:r>
               <w:t>Catatan: Desain konseptual dan prototipe arsitektur Phase 4 (Extreme Simplification) untuk mengurangi kompleksitas output.</w:t>
-              <w:br/>
-              <w:t>Dokumen Pendukung:</w:t>
-            </w:r>
-          </w:p>
-        </w:tc>
-      </w:tr>
-      <w:tr>
-        <w:tc>
-          <w:tcPr>
-            <w:tcW w:type="dxa" w:w="570"/>
+            </w:r>
+            <w:r>
+              <w:br/>
+              <w:t>Dokumen Pendukung:</w:t>
+            </w:r>
+          </w:p>
+        </w:tc>
+      </w:tr>
+      <w:tr>
+        <w:tc>
+          <w:tcPr>
+            <w:tcW w:w="570" w:type="dxa"/>
           </w:tcPr>
           <w:p>
             <w:r>
@@ -3782,7 +3738,7 @@
         </w:tc>
         <w:tc>
           <w:tcPr>
-            <w:tcW w:type="dxa" w:w="1948"/>
+            <w:tcW w:w="1948" w:type="dxa"/>
           </w:tcPr>
           <w:p>
             <w:r>
@@ -3792,21 +3748,23 @@
         </w:tc>
         <w:tc>
           <w:tcPr>
-            <w:tcW w:type="dxa" w:w="6602"/>
+            <w:tcW w:w="6602" w:type="dxa"/>
           </w:tcPr>
           <w:p>
             <w:r>
               <w:t>Catatan: Peralihan fokus menuju pendekatan Phase 5 (Multiple Choice Question / MCQ) demi efisiensi proses penalaran model mini.</w:t>
-              <w:br/>
-              <w:t>Dokumen Pendukung:</w:t>
-            </w:r>
-          </w:p>
-        </w:tc>
-      </w:tr>
-      <w:tr>
-        <w:tc>
-          <w:tcPr>
-            <w:tcW w:type="dxa" w:w="570"/>
+            </w:r>
+            <w:r>
+              <w:br/>
+              <w:t>Dokumen Pendukung:</w:t>
+            </w:r>
+          </w:p>
+        </w:tc>
+      </w:tr>
+      <w:tr>
+        <w:tc>
+          <w:tcPr>
+            <w:tcW w:w="570" w:type="dxa"/>
           </w:tcPr>
           <w:p>
             <w:r>
@@ -3816,7 +3774,7 @@
         </w:tc>
         <w:tc>
           <w:tcPr>
-            <w:tcW w:type="dxa" w:w="1948"/>
+            <w:tcW w:w="1948" w:type="dxa"/>
           </w:tcPr>
           <w:p>
             <w:r>
@@ -3826,21 +3784,23 @@
         </w:tc>
         <w:tc>
           <w:tcPr>
-            <w:tcW w:type="dxa" w:w="6602"/>
+            <w:tcW w:w="6602" w:type="dxa"/>
           </w:tcPr>
           <w:p>
             <w:r>
               <w:t>Catatan: Refaktorisasi prompt sistem secara masif dari instruksi naratif menjadi struktur pemilihan opsi (MCQ-Framing).</w:t>
-              <w:br/>
-              <w:t>Dokumen Pendukung:</w:t>
-            </w:r>
-          </w:p>
-        </w:tc>
-      </w:tr>
-      <w:tr>
-        <w:tc>
-          <w:tcPr>
-            <w:tcW w:type="dxa" w:w="570"/>
+            </w:r>
+            <w:r>
+              <w:br/>
+              <w:t>Dokumen Pendukung:</w:t>
+            </w:r>
+          </w:p>
+        </w:tc>
+      </w:tr>
+      <w:tr>
+        <w:tc>
+          <w:tcPr>
+            <w:tcW w:w="570" w:type="dxa"/>
           </w:tcPr>
           <w:p>
             <w:r>
@@ -3850,7 +3810,7 @@
         </w:tc>
         <w:tc>
           <w:tcPr>
-            <w:tcW w:type="dxa" w:w="1948"/>
+            <w:tcW w:w="1948" w:type="dxa"/>
           </w:tcPr>
           <w:p>
             <w:r>
@@ -3860,21 +3820,23 @@
         </w:tc>
         <w:tc>
           <w:tcPr>
-            <w:tcW w:type="dxa" w:w="6602"/>
+            <w:tcW w:w="6602" w:type="dxa"/>
           </w:tcPr>
           <w:p>
             <w:r>
               <w:t>Catatan: Uji coba pelaksanaan pipeline utuh memakai format MCQ dengan pengawasan respons langsung pada Gemma 3 270M.</w:t>
-              <w:br/>
-              <w:t>Dokumen Pendukung:</w:t>
-            </w:r>
-          </w:p>
-        </w:tc>
-      </w:tr>
-      <w:tr>
-        <w:tc>
-          <w:tcPr>
-            <w:tcW w:type="dxa" w:w="570"/>
+            </w:r>
+            <w:r>
+              <w:br/>
+              <w:t>Dokumen Pendukung:</w:t>
+            </w:r>
+          </w:p>
+        </w:tc>
+      </w:tr>
+      <w:tr>
+        <w:tc>
+          <w:tcPr>
+            <w:tcW w:w="570" w:type="dxa"/>
           </w:tcPr>
           <w:p>
             <w:r>
@@ -3884,7 +3846,7 @@
         </w:tc>
         <w:tc>
           <w:tcPr>
-            <w:tcW w:type="dxa" w:w="1948"/>
+            <w:tcW w:w="1948" w:type="dxa"/>
           </w:tcPr>
           <w:p>
             <w:r>
@@ -3894,21 +3856,23 @@
         </w:tc>
         <w:tc>
           <w:tcPr>
-            <w:tcW w:type="dxa" w:w="6602"/>
+            <w:tcW w:w="6602" w:type="dxa"/>
           </w:tcPr>
           <w:p>
             <w:r>
               <w:t>Catatan: Validasi tingkat keamanan kendala output skema MCQ, beserta penyelesaian penulisan rekapitulasi evaluasi performa SLM akhir.</w:t>
-              <w:br/>
-              <w:t>Dokumen Pendukung:</w:t>
-            </w:r>
-          </w:p>
-        </w:tc>
-      </w:tr>
-      <w:tr>
-        <w:tc>
-          <w:tcPr>
-            <w:tcW w:type="dxa" w:w="570"/>
+            </w:r>
+            <w:r>
+              <w:br/>
+              <w:t>Dokumen Pendukung:</w:t>
+            </w:r>
+          </w:p>
+        </w:tc>
+      </w:tr>
+      <w:tr>
+        <w:tc>
+          <w:tcPr>
+            <w:tcW w:w="570" w:type="dxa"/>
           </w:tcPr>
           <w:p>
             <w:r>
@@ -3918,7 +3882,7 @@
         </w:tc>
         <w:tc>
           <w:tcPr>
-            <w:tcW w:type="dxa" w:w="1948"/>
+            <w:tcW w:w="1948" w:type="dxa"/>
           </w:tcPr>
           <w:p>
             <w:r>
@@ -3928,21 +3892,23 @@
         </w:tc>
         <w:tc>
           <w:tcPr>
-            <w:tcW w:type="dxa" w:w="6602"/>
+            <w:tcW w:w="6602" w:type="dxa"/>
           </w:tcPr>
           <w:p>
             <w:r>
               <w:t>Catatan: Pelaksanaan fine-tuning model Gemma 3 12B dengan pendekatan QLoRA dan pengaturan hyperparameter optimal.</w:t>
-              <w:br/>
-              <w:t>Dokumen Pendukung:</w:t>
-            </w:r>
-          </w:p>
-        </w:tc>
-      </w:tr>
-      <w:tr>
-        <w:tc>
-          <w:tcPr>
-            <w:tcW w:type="dxa" w:w="570"/>
+            </w:r>
+            <w:r>
+              <w:br/>
+              <w:t>Dokumen Pendukung:</w:t>
+            </w:r>
+          </w:p>
+        </w:tc>
+      </w:tr>
+      <w:tr>
+        <w:tc>
+          <w:tcPr>
+            <w:tcW w:w="570" w:type="dxa"/>
           </w:tcPr>
           <w:p>
             <w:r>
@@ -3952,7 +3918,7 @@
         </w:tc>
         <w:tc>
           <w:tcPr>
-            <w:tcW w:type="dxa" w:w="1948"/>
+            <w:tcW w:w="1948" w:type="dxa"/>
           </w:tcPr>
           <w:p>
             <w:r>
@@ -3962,21 +3928,23 @@
         </w:tc>
         <w:tc>
           <w:tcPr>
-            <w:tcW w:type="dxa" w:w="6602"/>
+            <w:tcW w:w="6602" w:type="dxa"/>
           </w:tcPr>
           <w:p>
             <w:r>
               <w:t>Catatan: Integrasi komponen Retrieval-Augmented Generation (RAG) dengan FAISS untuk context-grounding.</w:t>
-              <w:br/>
-              <w:t>Dokumen Pendukung:</w:t>
-            </w:r>
-          </w:p>
-        </w:tc>
-      </w:tr>
-      <w:tr>
-        <w:tc>
-          <w:tcPr>
-            <w:tcW w:type="dxa" w:w="570"/>
+            </w:r>
+            <w:r>
+              <w:br/>
+              <w:t>Dokumen Pendukung:</w:t>
+            </w:r>
+          </w:p>
+        </w:tc>
+      </w:tr>
+      <w:tr>
+        <w:tc>
+          <w:tcPr>
+            <w:tcW w:w="570" w:type="dxa"/>
           </w:tcPr>
           <w:p>
             <w:r>
@@ -3986,7 +3954,7 @@
         </w:tc>
         <w:tc>
           <w:tcPr>
-            <w:tcW w:type="dxa" w:w="1948"/>
+            <w:tcW w:w="1948" w:type="dxa"/>
           </w:tcPr>
           <w:p>
             <w:r>
@@ -3996,31 +3964,34 @@
         </w:tc>
         <w:tc>
           <w:tcPr>
-            <w:tcW w:type="dxa" w:w="6602"/>
+            <w:tcW w:w="6602" w:type="dxa"/>
           </w:tcPr>
           <w:p>
             <w:r>
               <w:t>Catatan: Pengembangan dan pengujian layer Agen Explainer untuk menghasilkan justifikasi klasifikasi.</w:t>
-              <w:br/>
-              <w:t>Dokumen Pendukung:</w:t>
-            </w:r>
-          </w:p>
-        </w:tc>
-      </w:tr>
-      <w:tr>
-        <w:tc>
-          <w:tcPr>
-            <w:tcW w:type="dxa" w:w="570"/>
-          </w:tcPr>
-          <w:p>
-            <w:r>
+            </w:r>
+            <w:r>
+              <w:br/>
+              <w:t>Dokumen Pendukung:</w:t>
+            </w:r>
+          </w:p>
+        </w:tc>
+      </w:tr>
+      <w:tr>
+        <w:tc>
+          <w:tcPr>
+            <w:tcW w:w="570" w:type="dxa"/>
+          </w:tcPr>
+          <w:p>
+            <w:r>
+              <w:lastRenderedPageBreak/>
               <w:t>79</w:t>
             </w:r>
           </w:p>
         </w:tc>
         <w:tc>
           <w:tcPr>
-            <w:tcW w:type="dxa" w:w="1948"/>
+            <w:tcW w:w="1948" w:type="dxa"/>
           </w:tcPr>
           <w:p>
             <w:r>
@@ -4030,21 +4001,23 @@
         </w:tc>
         <w:tc>
           <w:tcPr>
-            <w:tcW w:type="dxa" w:w="6602"/>
+            <w:tcW w:w="6602" w:type="dxa"/>
           </w:tcPr>
           <w:p>
             <w:r>
               <w:t>Catatan: Pelaksanaan evaluasi kualitatif menggunakan protokol LLM-as-a-Judge (GPT-4o) untuk menilai jejak penalaran.</w:t>
-              <w:br/>
-              <w:t>Dokumen Pendukung:</w:t>
-            </w:r>
-          </w:p>
-        </w:tc>
-      </w:tr>
-      <w:tr>
-        <w:tc>
-          <w:tcPr>
-            <w:tcW w:type="dxa" w:w="570"/>
+            </w:r>
+            <w:r>
+              <w:br/>
+              <w:t>Dokumen Pendukung:</w:t>
+            </w:r>
+          </w:p>
+        </w:tc>
+      </w:tr>
+      <w:tr>
+        <w:tc>
+          <w:tcPr>
+            <w:tcW w:w="570" w:type="dxa"/>
           </w:tcPr>
           <w:p>
             <w:r>
@@ -4054,7 +4027,7 @@
         </w:tc>
         <w:tc>
           <w:tcPr>
-            <w:tcW w:type="dxa" w:w="1948"/>
+            <w:tcW w:w="1948" w:type="dxa"/>
           </w:tcPr>
           <w:p>
             <w:r>
@@ -4064,21 +4037,23 @@
         </w:tc>
         <w:tc>
           <w:tcPr>
-            <w:tcW w:type="dxa" w:w="6602"/>
+            <w:tcW w:w="6602" w:type="dxa"/>
           </w:tcPr>
           <w:p>
             <w:r>
               <w:t>Catatan: Analisis komparatif arsitektur backbone (Gemma 3, Qwen, Llama, GPT-OSS) terutama pada kategori Berita Batas/Kasus Ambigu.</w:t>
-              <w:br/>
-              <w:t>Dokumen Pendukung:</w:t>
-            </w:r>
-          </w:p>
-        </w:tc>
-      </w:tr>
-      <w:tr>
-        <w:tc>
-          <w:tcPr>
-            <w:tcW w:type="dxa" w:w="570"/>
+            </w:r>
+            <w:r>
+              <w:br/>
+              <w:t>Dokumen Pendukung:</w:t>
+            </w:r>
+          </w:p>
+        </w:tc>
+      </w:tr>
+      <w:tr>
+        <w:tc>
+          <w:tcPr>
+            <w:tcW w:w="570" w:type="dxa"/>
           </w:tcPr>
           <w:p>
             <w:r>
@@ -4088,7 +4063,7 @@
         </w:tc>
         <w:tc>
           <w:tcPr>
-            <w:tcW w:type="dxa" w:w="1948"/>
+            <w:tcW w:w="1948" w:type="dxa"/>
           </w:tcPr>
           <w:p>
             <w:r>
@@ -4098,21 +4073,23 @@
         </w:tc>
         <w:tc>
           <w:tcPr>
-            <w:tcW w:type="dxa" w:w="6602"/>
+            <w:tcW w:w="6602" w:type="dxa"/>
           </w:tcPr>
           <w:p>
             <w:r>
               <w:t>Catatan: Penyusunan draf awal artikel penelitian (versi bahasa Inggris) berdasarkan penemuan kerangka kerja AGENA.</w:t>
-              <w:br/>
-              <w:t>Dokumen Pendukung:</w:t>
-            </w:r>
-          </w:p>
-        </w:tc>
-      </w:tr>
-      <w:tr>
-        <w:tc>
-          <w:tcPr>
-            <w:tcW w:type="dxa" w:w="570"/>
+            </w:r>
+            <w:r>
+              <w:br/>
+              <w:t>Dokumen Pendukung:</w:t>
+            </w:r>
+          </w:p>
+        </w:tc>
+      </w:tr>
+      <w:tr>
+        <w:tc>
+          <w:tcPr>
+            <w:tcW w:w="570" w:type="dxa"/>
           </w:tcPr>
           <w:p>
             <w:r>
@@ -4122,7 +4099,7 @@
         </w:tc>
         <w:tc>
           <w:tcPr>
-            <w:tcW w:type="dxa" w:w="1948"/>
+            <w:tcW w:w="1948" w:type="dxa"/>
           </w:tcPr>
           <w:p>
             <w:r>
@@ -4132,21 +4109,23 @@
         </w:tc>
         <w:tc>
           <w:tcPr>
-            <w:tcW w:type="dxa" w:w="6602"/>
+            <w:tcW w:w="6602" w:type="dxa"/>
           </w:tcPr>
           <w:p>
             <w:r>
               <w:t>Catatan: Penerjemahan dan sinkronisasi draf artikel penelitian ke dalam bahasa Indonesia untuk target publikasi.</w:t>
-              <w:br/>
-              <w:t>Dokumen Pendukung:</w:t>
-            </w:r>
-          </w:p>
-        </w:tc>
-      </w:tr>
-      <w:tr>
-        <w:tc>
-          <w:tcPr>
-            <w:tcW w:type="dxa" w:w="570"/>
+            </w:r>
+            <w:r>
+              <w:br/>
+              <w:t>Dokumen Pendukung:</w:t>
+            </w:r>
+          </w:p>
+        </w:tc>
+      </w:tr>
+      <w:tr>
+        <w:tc>
+          <w:tcPr>
+            <w:tcW w:w="570" w:type="dxa"/>
           </w:tcPr>
           <w:p>
             <w:r>
@@ -4156,7 +4135,7 @@
         </w:tc>
         <w:tc>
           <w:tcPr>
-            <w:tcW w:type="dxa" w:w="1948"/>
+            <w:tcW w:w="1948" w:type="dxa"/>
           </w:tcPr>
           <w:p>
             <w:r>
@@ -4166,21 +4145,23 @@
         </w:tc>
         <w:tc>
           <w:tcPr>
-            <w:tcW w:type="dxa" w:w="6602"/>
+            <w:tcW w:w="6602" w:type="dxa"/>
           </w:tcPr>
           <w:p>
             <w:r>
               <w:t>Catatan: Pembuatan visualisasi diagram arsitektur multi-agen dan grafik performa matriks kebingungan (confusion matrix).</w:t>
-              <w:br/>
-              <w:t>Dokumen Pendukung:</w:t>
-            </w:r>
-          </w:p>
-        </w:tc>
-      </w:tr>
-      <w:tr>
-        <w:tc>
-          <w:tcPr>
-            <w:tcW w:type="dxa" w:w="570"/>
+            </w:r>
+            <w:r>
+              <w:br/>
+              <w:t>Dokumen Pendukung:</w:t>
+            </w:r>
+          </w:p>
+        </w:tc>
+      </w:tr>
+      <w:tr>
+        <w:tc>
+          <w:tcPr>
+            <w:tcW w:w="570" w:type="dxa"/>
           </w:tcPr>
           <w:p>
             <w:r>
@@ -4190,7 +4171,7 @@
         </w:tc>
         <w:tc>
           <w:tcPr>
-            <w:tcW w:type="dxa" w:w="1948"/>
+            <w:tcW w:w="1948" w:type="dxa"/>
           </w:tcPr>
           <w:p>
             <w:r>
@@ -4200,21 +4181,23 @@
         </w:tc>
         <w:tc>
           <w:tcPr>
-            <w:tcW w:type="dxa" w:w="6602"/>
-          </w:tcPr>
-          <w:p>
-            <w:r>
-              <w:t>Catatan: Finalisasi proofreading manuskrip penelitian, penyesuaian terminologi 'Berita Batas', dan penambahan komparasi baseline SENADA.</w:t>
-              <w:br/>
-              <w:t>Dokumen Pendukung:</w:t>
-            </w:r>
-          </w:p>
-        </w:tc>
-      </w:tr>
-      <w:tr>
-        <w:tc>
-          <w:tcPr>
-            <w:tcW w:type="dxa" w:w="570"/>
+            <w:tcW w:w="6602" w:type="dxa"/>
+          </w:tcPr>
+          <w:p>
+            <w:r>
+              <w:t>Catatan: Finalisasi proofreading manuskrip penelitian, dan penambahan komparasi baseline SENADA.</w:t>
+            </w:r>
+            <w:r>
+              <w:br/>
+              <w:t>Dokumen Pendukung:</w:t>
+            </w:r>
+          </w:p>
+        </w:tc>
+      </w:tr>
+      <w:tr>
+        <w:tc>
+          <w:tcPr>
+            <w:tcW w:w="570" w:type="dxa"/>
           </w:tcPr>
           <w:p>
             <w:r>
@@ -4224,7 +4207,7 @@
         </w:tc>
         <w:tc>
           <w:tcPr>
-            <w:tcW w:type="dxa" w:w="1948"/>
+            <w:tcW w:w="1948" w:type="dxa"/>
           </w:tcPr>
           <w:p>
             <w:r>
@@ -4234,21 +4217,30 @@
         </w:tc>
         <w:tc>
           <w:tcPr>
-            <w:tcW w:type="dxa" w:w="6602"/>
-          </w:tcPr>
-          <w:p>
-            <w:r>
-              <w:t>Catatan: Penyusunan bibliografi dan manajemen sitasi menggunakan Mendeley/Zotero, serta pengecekan akhir terhadap format penulisan jurnal target.</w:t>
-              <w:br/>
-              <w:t>Dokumen Pendukung:</w:t>
-            </w:r>
-          </w:p>
-        </w:tc>
-      </w:tr>
-      <w:tr>
-        <w:tc>
-          <w:tcPr>
-            <w:tcW w:type="dxa" w:w="570"/>
+            <w:tcW w:w="6602" w:type="dxa"/>
+          </w:tcPr>
+          <w:p>
+            <w:r>
+              <w:t xml:space="preserve">Catatan: </w:t>
+            </w:r>
+            <w:r>
+              <w:t>Pembuatan laporan kemajuan</w:t>
+            </w:r>
+            <w:r>
+              <w:t xml:space="preserve"> </w:t>
+            </w:r>
+          </w:p>
+          <w:p>
+            <w:r>
+              <w:t>Dokumen Pendukung:</w:t>
+            </w:r>
+          </w:p>
+        </w:tc>
+      </w:tr>
+      <w:tr>
+        <w:tc>
+          <w:tcPr>
+            <w:tcW w:w="570" w:type="dxa"/>
           </w:tcPr>
           <w:p>
             <w:r>
@@ -4258,7 +4250,7 @@
         </w:tc>
         <w:tc>
           <w:tcPr>
-            <w:tcW w:type="dxa" w:w="1948"/>
+            <w:tcW w:w="1948" w:type="dxa"/>
           </w:tcPr>
           <w:p>
             <w:r>
@@ -4268,21 +4260,26 @@
         </w:tc>
         <w:tc>
           <w:tcPr>
-            <w:tcW w:type="dxa" w:w="6602"/>
-          </w:tcPr>
-          <w:p>
-            <w:r>
-              <w:t>Catatan: Persiapan draf surat pengantar (cover letter) untuk pengajuan artikel ke jurnal internasional terpilih.</w:t>
-              <w:br/>
-              <w:t>Dokumen Pendukung:</w:t>
-            </w:r>
-          </w:p>
-        </w:tc>
-      </w:tr>
-      <w:tr>
-        <w:tc>
-          <w:tcPr>
-            <w:tcW w:type="dxa" w:w="570"/>
+            <w:tcW w:w="6602" w:type="dxa"/>
+          </w:tcPr>
+          <w:p>
+            <w:r>
+              <w:t xml:space="preserve">Catatan: </w:t>
+            </w:r>
+            <w:r>
+              <w:t>Pembuatan laporan kemajuan</w:t>
+            </w:r>
+            <w:r>
+              <w:br/>
+              <w:t>Dokumen Pendukung:</w:t>
+            </w:r>
+          </w:p>
+        </w:tc>
+      </w:tr>
+      <w:tr>
+        <w:tc>
+          <w:tcPr>
+            <w:tcW w:w="570" w:type="dxa"/>
           </w:tcPr>
           <w:p>
             <w:r>
@@ -4292,7 +4289,7 @@
         </w:tc>
         <w:tc>
           <w:tcPr>
-            <w:tcW w:type="dxa" w:w="1948"/>
+            <w:tcW w:w="1948" w:type="dxa"/>
           </w:tcPr>
           <w:p>
             <w:r>
@@ -4302,21 +4299,26 @@
         </w:tc>
         <w:tc>
           <w:tcPr>
-            <w:tcW w:type="dxa" w:w="6602"/>
-          </w:tcPr>
-          <w:p>
-            <w:r>
-              <w:t>Catatan: Pemeriksaan plagiarisme menggunakan Turnitin dan perbaikan kalimat berdasarkan saran alat bantu penulisan AI untuk meningkatkan keterbacaan.</w:t>
-              <w:br/>
-              <w:t>Dokumen Pendukung:</w:t>
-            </w:r>
-          </w:p>
-        </w:tc>
-      </w:tr>
-      <w:tr>
-        <w:tc>
-          <w:tcPr>
-            <w:tcW w:type="dxa" w:w="570"/>
+            <w:tcW w:w="6602" w:type="dxa"/>
+          </w:tcPr>
+          <w:p>
+            <w:r>
+              <w:t xml:space="preserve">Catatan: </w:t>
+            </w:r>
+            <w:r>
+              <w:t>Pembuatan laporan kemajuan</w:t>
+            </w:r>
+            <w:r>
+              <w:br/>
+              <w:t>Dokumen Pendukung:</w:t>
+            </w:r>
+          </w:p>
+        </w:tc>
+      </w:tr>
+      <w:tr>
+        <w:tc>
+          <w:tcPr>
+            <w:tcW w:w="570" w:type="dxa"/>
           </w:tcPr>
           <w:p>
             <w:r>
@@ -4326,7 +4328,7 @@
         </w:tc>
         <w:tc>
           <w:tcPr>
-            <w:tcW w:type="dxa" w:w="1948"/>
+            <w:tcW w:w="1948" w:type="dxa"/>
           </w:tcPr>
           <w:p>
             <w:r>
@@ -4336,21 +4338,30 @@
         </w:tc>
         <w:tc>
           <w:tcPr>
-            <w:tcW w:type="dxa" w:w="6602"/>
-          </w:tcPr>
-          <w:p>
-            <w:r>
-              <w:t>Catatan: Koordinasi dengan tim kolaborator terkait pembagian kontribusi penulis dan review internal naskah akhir.</w:t>
-              <w:br/>
-              <w:t>Dokumen Pendukung:</w:t>
-            </w:r>
-          </w:p>
-        </w:tc>
-      </w:tr>
-      <w:tr>
-        <w:tc>
-          <w:tcPr>
-            <w:tcW w:type="dxa" w:w="570"/>
+            <w:tcW w:w="6602" w:type="dxa"/>
+          </w:tcPr>
+          <w:p>
+            <w:r>
+              <w:t xml:space="preserve">Catatan: </w:t>
+            </w:r>
+            <w:r>
+              <w:t>Pembuatan laporan kemajuan</w:t>
+            </w:r>
+            <w:r>
+              <w:t xml:space="preserve"> </w:t>
+            </w:r>
+          </w:p>
+          <w:p>
+            <w:r>
+              <w:t>Dokumen Pendukung:</w:t>
+            </w:r>
+          </w:p>
+        </w:tc>
+      </w:tr>
+      <w:tr>
+        <w:tc>
+          <w:tcPr>
+            <w:tcW w:w="570" w:type="dxa"/>
           </w:tcPr>
           <w:p>
             <w:r>
@@ -4360,7 +4371,7 @@
         </w:tc>
         <w:tc>
           <w:tcPr>
-            <w:tcW w:type="dxa" w:w="1948"/>
+            <w:tcW w:w="1948" w:type="dxa"/>
           </w:tcPr>
           <w:p>
             <w:r>
@@ -4370,21 +4381,26 @@
         </w:tc>
         <w:tc>
           <w:tcPr>
-            <w:tcW w:type="dxa" w:w="6602"/>
-          </w:tcPr>
-          <w:p>
-            <w:r>
-              <w:t>Catatan: Pengunggahan (submission) naskah ke sistem manajemen jurnal (OJS) dan pemantauan status awal naskah.</w:t>
-              <w:br/>
-              <w:t>Dokumen Pendukung:</w:t>
-            </w:r>
-          </w:p>
-        </w:tc>
-      </w:tr>
-      <w:tr>
-        <w:tc>
-          <w:tcPr>
-            <w:tcW w:type="dxa" w:w="570"/>
+            <w:tcW w:w="6602" w:type="dxa"/>
+          </w:tcPr>
+          <w:p>
+            <w:r>
+              <w:t xml:space="preserve">Catatan: </w:t>
+            </w:r>
+            <w:r>
+              <w:t>Pembuatan laporan kemajuan</w:t>
+            </w:r>
+            <w:r>
+              <w:br/>
+              <w:t>Dokumen Pendukung:</w:t>
+            </w:r>
+          </w:p>
+        </w:tc>
+      </w:tr>
+      <w:tr>
+        <w:tc>
+          <w:tcPr>
+            <w:tcW w:w="570" w:type="dxa"/>
           </w:tcPr>
           <w:p>
             <w:r>
@@ -4394,7 +4410,7 @@
         </w:tc>
         <w:tc>
           <w:tcPr>
-            <w:tcW w:type="dxa" w:w="1948"/>
+            <w:tcW w:w="1948" w:type="dxa"/>
           </w:tcPr>
           <w:p>
             <w:r>
@@ -4404,11 +4420,13 @@
         </w:tc>
         <w:tc>
           <w:tcPr>
-            <w:tcW w:type="dxa" w:w="6602"/>
+            <w:tcW w:w="6602" w:type="dxa"/>
           </w:tcPr>
           <w:p>
             <w:r>
               <w:t>Catatan: Penyusunan repositori kode sumber di GitHub untuk memfasilitasi transparansi dan reproduktifitas penelitian oleh pihak luar.</w:t>
+            </w:r>
+            <w:r>
               <w:br/>
               <w:t>Dokumen Pendukung:</w:t>
             </w:r>

</xml_diff>

<commit_message>
feat: Implement "Lite RAG" by detecting small models, unifying RAG prompts, and adapting context generation with minimalist formatting to reduce noise.
</commit_message>
<xml_diff>
--- a/Catatan-Harian-Top-Tiers-Profesor-Doktor_Updated.docx
+++ b/Catatan-Harian-Top-Tiers-Profesor-Doktor_Updated.docx
@@ -1056,7 +1056,7 @@
     </w:p>
     <w:tbl>
       <w:tblPr>
-        <w:tblW w:w="0" w:type="auto"/>
+        <w:tblW w:w="9120" w:type="dxa"/>
         <w:tblBorders>
           <w:top w:val="single" w:sz="6" w:space="0" w:color="auto"/>
           <w:left w:val="single" w:sz="6" w:space="0" w:color="auto"/>
@@ -4224,37 +4224,73 @@
               <w:t xml:space="preserve">Catatan: </w:t>
             </w:r>
             <w:r>
+              <w:t xml:space="preserve">Pembuatan laporan kemajuan </w:t>
+            </w:r>
+          </w:p>
+          <w:p>
+            <w:r>
+              <w:t>Dokumen Pendukung:</w:t>
+            </w:r>
+          </w:p>
+        </w:tc>
+      </w:tr>
+      <w:tr>
+        <w:tc>
+          <w:tcPr>
+            <w:tcW w:w="570" w:type="dxa"/>
+          </w:tcPr>
+          <w:p>
+            <w:r>
+              <w:t>86</w:t>
+            </w:r>
+          </w:p>
+        </w:tc>
+        <w:tc>
+          <w:tcPr>
+            <w:tcW w:w="1948" w:type="dxa"/>
+          </w:tcPr>
+          <w:p>
+            <w:r>
+              <w:t>09 Mar 2026</w:t>
+            </w:r>
+          </w:p>
+        </w:tc>
+        <w:tc>
+          <w:tcPr>
+            <w:tcW w:w="6602" w:type="dxa"/>
+          </w:tcPr>
+          <w:p>
+            <w:r>
+              <w:t xml:space="preserve">Catatan: </w:t>
+            </w:r>
+            <w:r>
               <w:t>Pembuatan laporan kemajuan</w:t>
             </w:r>
             <w:r>
-              <w:t xml:space="preserve"> </w:t>
-            </w:r>
-          </w:p>
-          <w:p>
-            <w:r>
-              <w:t>Dokumen Pendukung:</w:t>
-            </w:r>
-          </w:p>
-        </w:tc>
-      </w:tr>
-      <w:tr>
-        <w:tc>
-          <w:tcPr>
-            <w:tcW w:w="570" w:type="dxa"/>
-          </w:tcPr>
-          <w:p>
-            <w:r>
-              <w:t>86</w:t>
-            </w:r>
-          </w:p>
-        </w:tc>
-        <w:tc>
-          <w:tcPr>
-            <w:tcW w:w="1948" w:type="dxa"/>
-          </w:tcPr>
-          <w:p>
-            <w:r>
-              <w:t>09 Mar 2026</w:t>
+              <w:br/>
+              <w:t>Dokumen Pendukung:</w:t>
+            </w:r>
+          </w:p>
+        </w:tc>
+      </w:tr>
+      <w:tr>
+        <w:tc>
+          <w:tcPr>
+            <w:tcW w:w="570" w:type="dxa"/>
+          </w:tcPr>
+          <w:p>
+            <w:r>
+              <w:t>87</w:t>
+            </w:r>
+          </w:p>
+        </w:tc>
+        <w:tc>
+          <w:tcPr>
+            <w:tcW w:w="1948" w:type="dxa"/>
+          </w:tcPr>
+          <w:p>
+            <w:r>
+              <w:t>10 Mar 2026</w:t>
             </w:r>
           </w:p>
         </w:tc>
@@ -4283,17 +4319,17 @@
           </w:tcPr>
           <w:p>
             <w:r>
-              <w:t>87</w:t>
-            </w:r>
-          </w:p>
-        </w:tc>
-        <w:tc>
-          <w:tcPr>
-            <w:tcW w:w="1948" w:type="dxa"/>
-          </w:tcPr>
-          <w:p>
-            <w:r>
-              <w:t>10 Mar 2026</w:t>
+              <w:t>88</w:t>
+            </w:r>
+          </w:p>
+        </w:tc>
+        <w:tc>
+          <w:tcPr>
+            <w:tcW w:w="1948" w:type="dxa"/>
+          </w:tcPr>
+          <w:p>
+            <w:r>
+              <w:t>11 Mar 2026</w:t>
             </w:r>
           </w:p>
         </w:tc>
@@ -4306,6 +4342,46 @@
               <w:t xml:space="preserve">Catatan: </w:t>
             </w:r>
             <w:r>
+              <w:t xml:space="preserve">Pembuatan laporan kemajuan </w:t>
+            </w:r>
+          </w:p>
+          <w:p>
+            <w:r>
+              <w:t>Dokumen Pendukung:</w:t>
+            </w:r>
+          </w:p>
+        </w:tc>
+      </w:tr>
+      <w:tr>
+        <w:tc>
+          <w:tcPr>
+            <w:tcW w:w="570" w:type="dxa"/>
+          </w:tcPr>
+          <w:p>
+            <w:r>
+              <w:t>89</w:t>
+            </w:r>
+          </w:p>
+        </w:tc>
+        <w:tc>
+          <w:tcPr>
+            <w:tcW w:w="1948" w:type="dxa"/>
+          </w:tcPr>
+          <w:p>
+            <w:r>
+              <w:t>12 Mar 2026</w:t>
+            </w:r>
+          </w:p>
+        </w:tc>
+        <w:tc>
+          <w:tcPr>
+            <w:tcW w:w="6602" w:type="dxa"/>
+          </w:tcPr>
+          <w:p>
+            <w:r>
+              <w:t xml:space="preserve">Catatan: </w:t>
+            </w:r>
+            <w:r>
               <w:t>Pembuatan laporan kemajuan</w:t>
             </w:r>
             <w:r>
@@ -4322,88 +4398,6 @@
           </w:tcPr>
           <w:p>
             <w:r>
-              <w:t>88</w:t>
-            </w:r>
-          </w:p>
-        </w:tc>
-        <w:tc>
-          <w:tcPr>
-            <w:tcW w:w="1948" w:type="dxa"/>
-          </w:tcPr>
-          <w:p>
-            <w:r>
-              <w:t>11 Mar 2026</w:t>
-            </w:r>
-          </w:p>
-        </w:tc>
-        <w:tc>
-          <w:tcPr>
-            <w:tcW w:w="6602" w:type="dxa"/>
-          </w:tcPr>
-          <w:p>
-            <w:r>
-              <w:t xml:space="preserve">Catatan: </w:t>
-            </w:r>
-            <w:r>
-              <w:t>Pembuatan laporan kemajuan</w:t>
-            </w:r>
-            <w:r>
-              <w:t xml:space="preserve"> </w:t>
-            </w:r>
-          </w:p>
-          <w:p>
-            <w:r>
-              <w:t>Dokumen Pendukung:</w:t>
-            </w:r>
-          </w:p>
-        </w:tc>
-      </w:tr>
-      <w:tr>
-        <w:tc>
-          <w:tcPr>
-            <w:tcW w:w="570" w:type="dxa"/>
-          </w:tcPr>
-          <w:p>
-            <w:r>
-              <w:t>89</w:t>
-            </w:r>
-          </w:p>
-        </w:tc>
-        <w:tc>
-          <w:tcPr>
-            <w:tcW w:w="1948" w:type="dxa"/>
-          </w:tcPr>
-          <w:p>
-            <w:r>
-              <w:t>12 Mar 2026</w:t>
-            </w:r>
-          </w:p>
-        </w:tc>
-        <w:tc>
-          <w:tcPr>
-            <w:tcW w:w="6602" w:type="dxa"/>
-          </w:tcPr>
-          <w:p>
-            <w:r>
-              <w:t xml:space="preserve">Catatan: </w:t>
-            </w:r>
-            <w:r>
-              <w:t>Pembuatan laporan kemajuan</w:t>
-            </w:r>
-            <w:r>
-              <w:br/>
-              <w:t>Dokumen Pendukung:</w:t>
-            </w:r>
-          </w:p>
-        </w:tc>
-      </w:tr>
-      <w:tr>
-        <w:tc>
-          <w:tcPr>
-            <w:tcW w:w="570" w:type="dxa"/>
-          </w:tcPr>
-          <w:p>
-            <w:r>
               <w:t>90</w:t>
             </w:r>
           </w:p>
@@ -4429,6 +4423,198 @@
             <w:r>
               <w:br/>
               <w:t>Dokumen Pendukung:</w:t>
+            </w:r>
+          </w:p>
+        </w:tc>
+      </w:tr>
+      <w:tr>
+        <w:tc>
+          <w:tcPr>
+            <w:tcW w:w="570" w:type="dxa"/>
+          </w:tcPr>
+          <w:p>
+            <w:r>
+              <w:t>91</w:t>
+            </w:r>
+          </w:p>
+        </w:tc>
+        <w:tc>
+          <w:tcPr>
+            <w:tcW w:w="1948" w:type="dxa"/>
+          </w:tcPr>
+          <w:p>
+            <w:r>
+              <w:t>16 Maret 2026</w:t>
+            </w:r>
+          </w:p>
+        </w:tc>
+        <w:tc>
+          <w:tcPr>
+            <w:tcW w:w="6602" w:type="dxa"/>
+          </w:tcPr>
+          <w:p>
+            <w:r>
+              <w:t>Catatan: Penambahan dataset bahasa inggris</w:t>
+            </w:r>
+          </w:p>
+        </w:tc>
+      </w:tr>
+      <w:tr>
+        <w:tc>
+          <w:tcPr>
+            <w:tcW w:w="570" w:type="dxa"/>
+          </w:tcPr>
+          <w:p>
+            <w:r>
+              <w:t>92</w:t>
+            </w:r>
+          </w:p>
+        </w:tc>
+        <w:tc>
+          <w:tcPr>
+            <w:tcW w:w="1948" w:type="dxa"/>
+          </w:tcPr>
+          <w:p>
+            <w:r>
+              <w:t>17 Maret 2026</w:t>
+            </w:r>
+          </w:p>
+        </w:tc>
+        <w:tc>
+          <w:tcPr>
+            <w:tcW w:w="6602" w:type="dxa"/>
+          </w:tcPr>
+          <w:p>
+            <w:r>
+              <w:t>Catatan: Diskusi dengan Mitra</w:t>
+            </w:r>
+          </w:p>
+        </w:tc>
+      </w:tr>
+      <w:tr>
+        <w:tc>
+          <w:tcPr>
+            <w:tcW w:w="570" w:type="dxa"/>
+          </w:tcPr>
+          <w:p>
+            <w:r>
+              <w:t>93</w:t>
+            </w:r>
+          </w:p>
+        </w:tc>
+        <w:tc>
+          <w:tcPr>
+            <w:tcW w:w="1948" w:type="dxa"/>
+          </w:tcPr>
+          <w:p>
+            <w:r>
+              <w:t>25 Maret 2026</w:t>
+            </w:r>
+          </w:p>
+        </w:tc>
+        <w:tc>
+          <w:tcPr>
+            <w:tcW w:w="6602" w:type="dxa"/>
+          </w:tcPr>
+          <w:p>
+            <w:r>
+              <w:t>Catatan: Finetuning + evaluasi Model dengan Dataset Bahasa Indonesia + Inggris</w:t>
+            </w:r>
+          </w:p>
+        </w:tc>
+      </w:tr>
+      <w:tr>
+        <w:tc>
+          <w:tcPr>
+            <w:tcW w:w="570" w:type="dxa"/>
+          </w:tcPr>
+          <w:p>
+            <w:r>
+              <w:t>94</w:t>
+            </w:r>
+          </w:p>
+        </w:tc>
+        <w:tc>
+          <w:tcPr>
+            <w:tcW w:w="1948" w:type="dxa"/>
+          </w:tcPr>
+          <w:p>
+            <w:r>
+              <w:t>26 Maret 2026</w:t>
+            </w:r>
+          </w:p>
+        </w:tc>
+        <w:tc>
+          <w:tcPr>
+            <w:tcW w:w="6602" w:type="dxa"/>
+          </w:tcPr>
+          <w:p>
+            <w:r>
+              <w:t>Catatan: Finetuning + evaluasi Model dengan Dataset Bahasa Indonesia + Inggris</w:t>
+            </w:r>
+          </w:p>
+        </w:tc>
+      </w:tr>
+      <w:tr>
+        <w:tc>
+          <w:tcPr>
+            <w:tcW w:w="570" w:type="dxa"/>
+          </w:tcPr>
+          <w:p>
+            <w:r>
+              <w:t>95</w:t>
+            </w:r>
+          </w:p>
+        </w:tc>
+        <w:tc>
+          <w:tcPr>
+            <w:tcW w:w="1948" w:type="dxa"/>
+          </w:tcPr>
+          <w:p>
+            <w:r>
+              <w:t>27 Maret 2026</w:t>
+            </w:r>
+          </w:p>
+        </w:tc>
+        <w:tc>
+          <w:tcPr>
+            <w:tcW w:w="6602" w:type="dxa"/>
+          </w:tcPr>
+          <w:p>
+            <w:r>
+              <w:t>Catatan: Finetuning + evaluasi Model dengan Dataset Bahasa Indonesia + Inggris</w:t>
+            </w:r>
+          </w:p>
+        </w:tc>
+      </w:tr>
+      <w:tr>
+        <w:tc>
+          <w:tcPr>
+            <w:tcW w:w="570" w:type="dxa"/>
+          </w:tcPr>
+          <w:p>
+            <w:r>
+              <w:t>96</w:t>
+            </w:r>
+          </w:p>
+        </w:tc>
+        <w:tc>
+          <w:tcPr>
+            <w:tcW w:w="1948" w:type="dxa"/>
+          </w:tcPr>
+          <w:p>
+            <w:r>
+              <w:t>30 Maret 2026</w:t>
+            </w:r>
+          </w:p>
+        </w:tc>
+        <w:tc>
+          <w:tcPr>
+            <w:tcW w:w="6602" w:type="dxa"/>
+          </w:tcPr>
+          <w:p>
+            <w:r>
+              <w:t>Catatan: Finetuning + evaluasi Model dengan Dataset Bahasa Indonesia + Inggris</w:t>
             </w:r>
           </w:p>
         </w:tc>

</xml_diff>